<commit_message>
docs(thesis): add explanatory maps to reading document
</commit_message>
<xml_diff>
--- a/12_Tesis/GOEI_Documento_de_Lectura_Proyecto_2026-08-04.docx
+++ b/12_Tesis/GOEI_Documento_de_Lectura_Proyecto_2026-08-04.docx
@@ -78,6 +78,60 @@
     </w:p>
     <w:p>
       <w:pPr>
+        <w:spacing w:before="120" w:after="60"/>
+        <w:jc w:val="center"/>
+      </w:pPr>
+      <w:r>
+        <w:drawing>
+          <wp:inline xmlns:a="http://schemas.openxmlformats.org/drawingml/2006/main" xmlns:pic="http://schemas.openxmlformats.org/drawingml/2006/picture">
+            <wp:extent cx="6172200" cy="3506932"/>
+            <wp:docPr id="1" name="Picture 1"/>
+            <wp:cNvGraphicFramePr>
+              <a:graphicFrameLocks noChangeAspect="1"/>
+            </wp:cNvGraphicFramePr>
+            <a:graphic>
+              <a:graphicData uri="http://schemas.openxmlformats.org/drawingml/2006/picture">
+                <pic:pic>
+                  <pic:nvPicPr>
+                    <pic:cNvPr id="0" name="01_mapa_mental_goei.png"/>
+                    <pic:cNvPicPr/>
+                  </pic:nvPicPr>
+                  <pic:blipFill>
+                    <a:blip r:embed="rId11"/>
+                    <a:stretch>
+                      <a:fillRect/>
+                    </a:stretch>
+                  </pic:blipFill>
+                  <pic:spPr>
+                    <a:xfrm>
+                      <a:off x="0" y="0"/>
+                      <a:ext cx="6172200" cy="3506932"/>
+                    </a:xfrm>
+                    <a:prstGeom prst="rect"/>
+                  </pic:spPr>
+                </pic:pic>
+              </a:graphicData>
+            </a:graphic>
+          </wp:inline>
+        </w:drawing>
+      </w:r>
+    </w:p>
+    <w:p>
+      <w:pPr>
+        <w:spacing w:after="200"/>
+        <w:jc w:val="center"/>
+      </w:pPr>
+      <w:r>
+        <w:rPr>
+          <w:i/>
+          <w:color w:val="595959"/>
+          <w:sz w:val="18"/>
+        </w:rPr>
+        <w:t>Mapa mental general del proyecto GOEI</w:t>
+      </w:r>
+    </w:p>
+    <w:p>
+      <w:pPr>
         <w:widowControl/>
       </w:pPr>
       <w:r>
@@ -182,6 +236,60 @@
     </w:p>
     <w:p>
       <w:pPr>
+        <w:spacing w:before="120" w:after="60"/>
+        <w:jc w:val="center"/>
+      </w:pPr>
+      <w:r>
+        <w:drawing>
+          <wp:inline xmlns:a="http://schemas.openxmlformats.org/drawingml/2006/main" xmlns:pic="http://schemas.openxmlformats.org/drawingml/2006/picture">
+            <wp:extent cx="6172200" cy="3506932"/>
+            <wp:docPr id="2" name="Picture 2"/>
+            <wp:cNvGraphicFramePr>
+              <a:graphicFrameLocks noChangeAspect="1"/>
+            </wp:cNvGraphicFramePr>
+            <a:graphic>
+              <a:graphicData uri="http://schemas.openxmlformats.org/drawingml/2006/picture">
+                <pic:pic>
+                  <pic:nvPicPr>
+                    <pic:cNvPr id="0" name="02_mapa_autoridad.png"/>
+                    <pic:cNvPicPr/>
+                  </pic:nvPicPr>
+                  <pic:blipFill>
+                    <a:blip r:embed="rId12"/>
+                    <a:stretch>
+                      <a:fillRect/>
+                    </a:stretch>
+                  </pic:blipFill>
+                  <pic:spPr>
+                    <a:xfrm>
+                      <a:off x="0" y="0"/>
+                      <a:ext cx="6172200" cy="3506932"/>
+                    </a:xfrm>
+                    <a:prstGeom prst="rect"/>
+                  </pic:spPr>
+                </pic:pic>
+              </a:graphicData>
+            </a:graphic>
+          </wp:inline>
+        </w:drawing>
+      </w:r>
+    </w:p>
+    <w:p>
+      <w:pPr>
+        <w:spacing w:after="200"/>
+        <w:jc w:val="center"/>
+      </w:pPr>
+      <w:r>
+        <w:rPr>
+          <w:i/>
+          <w:color w:val="595959"/>
+          <w:sz w:val="18"/>
+        </w:rPr>
+        <w:t>Autoridad y separación de responsabilidades</w:t>
+      </w:r>
+    </w:p>
+    <w:p>
+      <w:pPr>
         <w:widowControl/>
       </w:pPr>
       <w:r>
@@ -270,6 +378,60 @@
     </w:p>
     <w:p>
       <w:pPr>
+        <w:spacing w:before="120" w:after="60"/>
+        <w:jc w:val="center"/>
+      </w:pPr>
+      <w:r>
+        <w:drawing>
+          <wp:inline xmlns:a="http://schemas.openxmlformats.org/drawingml/2006/main" xmlns:pic="http://schemas.openxmlformats.org/drawingml/2006/picture">
+            <wp:extent cx="6172200" cy="3506932"/>
+            <wp:docPr id="3" name="Picture 3"/>
+            <wp:cNvGraphicFramePr>
+              <a:graphicFrameLocks noChangeAspect="1"/>
+            </wp:cNvGraphicFramePr>
+            <a:graphic>
+              <a:graphicData uri="http://schemas.openxmlformats.org/drawingml/2006/picture">
+                <pic:pic>
+                  <pic:nvPicPr>
+                    <pic:cNvPr id="0" name="03_flujo_trazabilidad.png"/>
+                    <pic:cNvPicPr/>
+                  </pic:nvPicPr>
+                  <pic:blipFill>
+                    <a:blip r:embed="rId13"/>
+                    <a:stretch>
+                      <a:fillRect/>
+                    </a:stretch>
+                  </pic:blipFill>
+                  <pic:spPr>
+                    <a:xfrm>
+                      <a:off x="0" y="0"/>
+                      <a:ext cx="6172200" cy="3506932"/>
+                    </a:xfrm>
+                    <a:prstGeom prst="rect"/>
+                  </pic:spPr>
+                </pic:pic>
+              </a:graphicData>
+            </a:graphic>
+          </wp:inline>
+        </w:drawing>
+      </w:r>
+    </w:p>
+    <w:p>
+      <w:pPr>
+        <w:spacing w:after="200"/>
+        <w:jc w:val="center"/>
+      </w:pPr>
+      <w:r>
+        <w:rPr>
+          <w:i/>
+          <w:color w:val="595959"/>
+          <w:sz w:val="18"/>
+        </w:rPr>
+        <w:t>Cadena de trazabilidad del conocimiento</w:t>
+      </w:r>
+    </w:p>
+    <w:p>
+      <w:pPr>
         <w:widowControl/>
       </w:pPr>
       <w:r>
@@ -398,6 +560,60 @@
     </w:p>
     <w:p>
       <w:pPr>
+        <w:spacing w:before="120" w:after="60"/>
+        <w:jc w:val="center"/>
+      </w:pPr>
+      <w:r>
+        <w:drawing>
+          <wp:inline xmlns:a="http://schemas.openxmlformats.org/drawingml/2006/main" xmlns:pic="http://schemas.openxmlformats.org/drawingml/2006/picture">
+            <wp:extent cx="6172200" cy="3506932"/>
+            <wp:docPr id="4" name="Picture 4"/>
+            <wp:cNvGraphicFramePr>
+              <a:graphicFrameLocks noChangeAspect="1"/>
+            </wp:cNvGraphicFramePr>
+            <a:graphic>
+              <a:graphicData uri="http://schemas.openxmlformats.org/drawingml/2006/picture">
+                <pic:pic>
+                  <pic:nvPicPr>
+                    <pic:cNvPr id="0" name="04_mapa_operacional_p1_p9.png"/>
+                    <pic:cNvPicPr/>
+                  </pic:nvPicPr>
+                  <pic:blipFill>
+                    <a:blip r:embed="rId14"/>
+                    <a:stretch>
+                      <a:fillRect/>
+                    </a:stretch>
+                  </pic:blipFill>
+                  <pic:spPr>
+                    <a:xfrm>
+                      <a:off x="0" y="0"/>
+                      <a:ext cx="6172200" cy="3506932"/>
+                    </a:xfrm>
+                    <a:prstGeom prst="rect"/>
+                  </pic:spPr>
+                </pic:pic>
+              </a:graphicData>
+            </a:graphic>
+          </wp:inline>
+        </w:drawing>
+      </w:r>
+    </w:p>
+    <w:p>
+      <w:pPr>
+        <w:spacing w:after="200"/>
+        <w:jc w:val="center"/>
+      </w:pPr>
+      <w:r>
+        <w:rPr>
+          <w:i/>
+          <w:color w:val="595959"/>
+          <w:sz w:val="18"/>
+        </w:rPr>
+        <w:t>Mapa operacional universal P1–P9</w:t>
+      </w:r>
+    </w:p>
+    <w:p>
+      <w:pPr>
         <w:widowControl/>
       </w:pPr>
       <w:r>
@@ -742,6 +958,60 @@
     </w:p>
     <w:p>
       <w:pPr>
+        <w:spacing w:before="120" w:after="60"/>
+        <w:jc w:val="center"/>
+      </w:pPr>
+      <w:r>
+        <w:drawing>
+          <wp:inline xmlns:a="http://schemas.openxmlformats.org/drawingml/2006/main" xmlns:pic="http://schemas.openxmlformats.org/drawingml/2006/picture">
+            <wp:extent cx="6172200" cy="3506932"/>
+            <wp:docPr id="5" name="Picture 5"/>
+            <wp:cNvGraphicFramePr>
+              <a:graphicFrameLocks noChangeAspect="1"/>
+            </wp:cNvGraphicFramePr>
+            <a:graphic>
+              <a:graphicData uri="http://schemas.openxmlformats.org/drawingml/2006/picture">
+                <pic:pic>
+                  <pic:nvPicPr>
+                    <pic:cNvPr id="0" name="06_mapa_gtrm.png"/>
+                    <pic:cNvPicPr/>
+                  </pic:nvPicPr>
+                  <pic:blipFill>
+                    <a:blip r:embed="rId15"/>
+                    <a:stretch>
+                      <a:fillRect/>
+                    </a:stretch>
+                  </pic:blipFill>
+                  <pic:spPr>
+                    <a:xfrm>
+                      <a:off x="0" y="0"/>
+                      <a:ext cx="6172200" cy="3506932"/>
+                    </a:xfrm>
+                    <a:prstGeom prst="rect"/>
+                  </pic:spPr>
+                </pic:pic>
+              </a:graphicData>
+            </a:graphic>
+          </wp:inline>
+        </w:drawing>
+      </w:r>
+    </w:p>
+    <w:p>
+      <w:pPr>
+        <w:spacing w:after="200"/>
+        <w:jc w:val="center"/>
+      </w:pPr>
+      <w:r>
+        <w:rPr>
+          <w:i/>
+          <w:color w:val="595959"/>
+          <w:sz w:val="18"/>
+        </w:rPr>
+        <w:t>Transformación conceptual GTRM</w:t>
+      </w:r>
+    </w:p>
+    <w:p>
+      <w:pPr>
         <w:widowControl/>
       </w:pPr>
       <w:r>
@@ -926,6 +1196,114 @@
     </w:p>
     <w:p>
       <w:pPr>
+        <w:spacing w:before="120" w:after="60"/>
+        <w:jc w:val="center"/>
+      </w:pPr>
+      <w:r>
+        <w:drawing>
+          <wp:inline xmlns:a="http://schemas.openxmlformats.org/drawingml/2006/main" xmlns:pic="http://schemas.openxmlformats.org/drawingml/2006/picture">
+            <wp:extent cx="6172200" cy="3506932"/>
+            <wp:docPr id="6" name="Picture 6"/>
+            <wp:cNvGraphicFramePr>
+              <a:graphicFrameLocks noChangeAspect="1"/>
+            </wp:cNvGraphicFramePr>
+            <a:graphic>
+              <a:graphicData uri="http://schemas.openxmlformats.org/drawingml/2006/picture">
+                <pic:pic>
+                  <pic:nvPicPr>
+                    <pic:cNvPr id="0" name="05_linea_tiempo.png"/>
+                    <pic:cNvPicPr/>
+                  </pic:nvPicPr>
+                  <pic:blipFill>
+                    <a:blip r:embed="rId16"/>
+                    <a:stretch>
+                      <a:fillRect/>
+                    </a:stretch>
+                  </pic:blipFill>
+                  <pic:spPr>
+                    <a:xfrm>
+                      <a:off x="0" y="0"/>
+                      <a:ext cx="6172200" cy="3506932"/>
+                    </a:xfrm>
+                    <a:prstGeom prst="rect"/>
+                  </pic:spPr>
+                </pic:pic>
+              </a:graphicData>
+            </a:graphic>
+          </wp:inline>
+        </w:drawing>
+      </w:r>
+    </w:p>
+    <w:p>
+      <w:pPr>
+        <w:spacing w:after="200"/>
+        <w:jc w:val="center"/>
+      </w:pPr>
+      <w:r>
+        <w:rPr>
+          <w:i/>
+          <w:color w:val="595959"/>
+          <w:sz w:val="18"/>
+        </w:rPr>
+        <w:t>Línea temporal hasta D-019</w:t>
+      </w:r>
+    </w:p>
+    <w:p>
+      <w:pPr>
+        <w:spacing w:before="120" w:after="60"/>
+        <w:jc w:val="center"/>
+      </w:pPr>
+      <w:r>
+        <w:drawing>
+          <wp:inline xmlns:a="http://schemas.openxmlformats.org/drawingml/2006/main" xmlns:pic="http://schemas.openxmlformats.org/drawingml/2006/picture">
+            <wp:extent cx="6172200" cy="3506932"/>
+            <wp:docPr id="7" name="Picture 7"/>
+            <wp:cNvGraphicFramePr>
+              <a:graphicFrameLocks noChangeAspect="1"/>
+            </wp:cNvGraphicFramePr>
+            <a:graphic>
+              <a:graphicData uri="http://schemas.openxmlformats.org/drawingml/2006/picture">
+                <pic:pic>
+                  <pic:nvPicPr>
+                    <pic:cNvPr id="0" name="07_pipeline_b1_b10.png"/>
+                    <pic:cNvPicPr/>
+                  </pic:nvPicPr>
+                  <pic:blipFill>
+                    <a:blip r:embed="rId17"/>
+                    <a:stretch>
+                      <a:fillRect/>
+                    </a:stretch>
+                  </pic:blipFill>
+                  <pic:spPr>
+                    <a:xfrm>
+                      <a:off x="0" y="0"/>
+                      <a:ext cx="6172200" cy="3506932"/>
+                    </a:xfrm>
+                    <a:prstGeom prst="rect"/>
+                  </pic:spPr>
+                </pic:pic>
+              </a:graphicData>
+            </a:graphic>
+          </wp:inline>
+        </w:drawing>
+      </w:r>
+    </w:p>
+    <w:p>
+      <w:pPr>
+        <w:spacing w:after="200"/>
+        <w:jc w:val="center"/>
+      </w:pPr>
+      <w:r>
+        <w:rPr>
+          <w:i/>
+          <w:color w:val="595959"/>
+          <w:sz w:val="18"/>
+        </w:rPr>
+        <w:t>Pipeline operativo B1–B10</w:t>
+      </w:r>
+    </w:p>
+    <w:p>
+      <w:pPr>
         <w:widowControl/>
       </w:pPr>
       <w:r>
@@ -1182,6 +1560,60 @@
     </w:p>
     <w:p>
       <w:pPr>
+        <w:spacing w:before="120" w:after="60"/>
+        <w:jc w:val="center"/>
+      </w:pPr>
+      <w:r>
+        <w:drawing>
+          <wp:inline xmlns:a="http://schemas.openxmlformats.org/drawingml/2006/main" xmlns:pic="http://schemas.openxmlformats.org/drawingml/2006/picture">
+            <wp:extent cx="6172200" cy="3506932"/>
+            <wp:docPr id="8" name="Picture 8"/>
+            <wp:cNvGraphicFramePr>
+              <a:graphicFrameLocks noChangeAspect="1"/>
+            </wp:cNvGraphicFramePr>
+            <a:graphic>
+              <a:graphicData uri="http://schemas.openxmlformats.org/drawingml/2006/picture">
+                <pic:pic>
+                  <pic:nvPicPr>
+                    <pic:cNvPr id="0" name="08_mapa_estado.png"/>
+                    <pic:cNvPicPr/>
+                  </pic:nvPicPr>
+                  <pic:blipFill>
+                    <a:blip r:embed="rId18"/>
+                    <a:stretch>
+                      <a:fillRect/>
+                    </a:stretch>
+                  </pic:blipFill>
+                  <pic:spPr>
+                    <a:xfrm>
+                      <a:off x="0" y="0"/>
+                      <a:ext cx="6172200" cy="3506932"/>
+                    </a:xfrm>
+                    <a:prstGeom prst="rect"/>
+                  </pic:spPr>
+                </pic:pic>
+              </a:graphicData>
+            </a:graphic>
+          </wp:inline>
+        </w:drawing>
+      </w:r>
+    </w:p>
+    <w:p>
+      <w:pPr>
+        <w:spacing w:after="200"/>
+        <w:jc w:val="center"/>
+      </w:pPr>
+      <w:r>
+        <w:rPr>
+          <w:i/>
+          <w:color w:val="595959"/>
+          <w:sz w:val="18"/>
+        </w:rPr>
+        <w:t>Estado del proyecto: terminado, en curso y pendiente</w:t>
+      </w:r>
+    </w:p>
+    <w:p>
+      <w:pPr>
         <w:widowControl/>
       </w:pPr>
       <w:r>
@@ -1582,6 +2014,60 @@
     </w:p>
     <w:p>
       <w:pPr>
+        <w:spacing w:before="120" w:after="60"/>
+        <w:jc w:val="center"/>
+      </w:pPr>
+      <w:r>
+        <w:drawing>
+          <wp:inline xmlns:a="http://schemas.openxmlformats.org/drawingml/2006/main" xmlns:pic="http://schemas.openxmlformats.org/drawingml/2006/picture">
+            <wp:extent cx="6172200" cy="3506932"/>
+            <wp:docPr id="9" name="Picture 9"/>
+            <wp:cNvGraphicFramePr>
+              <a:graphicFrameLocks noChangeAspect="1"/>
+            </wp:cNvGraphicFramePr>
+            <a:graphic>
+              <a:graphicData uri="http://schemas.openxmlformats.org/drawingml/2006/picture">
+                <pic:pic>
+                  <pic:nvPicPr>
+                    <pic:cNvPr id="0" name="09_ruta_tesis_publicacion.png"/>
+                    <pic:cNvPicPr/>
+                  </pic:nvPicPr>
+                  <pic:blipFill>
+                    <a:blip r:embed="rId19"/>
+                    <a:stretch>
+                      <a:fillRect/>
+                    </a:stretch>
+                  </pic:blipFill>
+                  <pic:spPr>
+                    <a:xfrm>
+                      <a:off x="0" y="0"/>
+                      <a:ext cx="6172200" cy="3506932"/>
+                    </a:xfrm>
+                    <a:prstGeom prst="rect"/>
+                  </pic:spPr>
+                </pic:pic>
+              </a:graphicData>
+            </a:graphic>
+          </wp:inline>
+        </w:drawing>
+      </w:r>
+    </w:p>
+    <w:p>
+      <w:pPr>
+        <w:spacing w:after="200"/>
+        <w:jc w:val="center"/>
+      </w:pPr>
+      <w:r>
+        <w:rPr>
+          <w:i/>
+          <w:color w:val="595959"/>
+          <w:sz w:val="18"/>
+        </w:rPr>
+        <w:t>Ruta desde el estándar hasta la tesis y la publicación</w:t>
+      </w:r>
+    </w:p>
+    <w:p>
+      <w:pPr>
         <w:widowControl/>
       </w:pPr>
       <w:r>
@@ -1675,8 +2161,12 @@
           <w:ilvl w:val="0"/>
           <w:numId w:val="17"/>
         </w:numPr>
+        <w:spacing w:after="0"/>
       </w:pPr>
       <w:r>
+        <w:rPr>
+          <w:sz w:val="19"/>
+        </w:rPr>
         <w:t>Se define la visión del GOEI como estándar internacional de salud operacional.</w:t>
       </w:r>
     </w:p>
@@ -1687,8 +2177,12 @@
           <w:ilvl w:val="0"/>
           <w:numId w:val="17"/>
         </w:numPr>
+        <w:spacing w:after="0"/>
       </w:pPr>
       <w:r>
+        <w:rPr>
+          <w:sz w:val="19"/>
+        </w:rPr>
         <w:t>Se decide construir el estándar antes que la tesis.</w:t>
       </w:r>
     </w:p>
@@ -1699,8 +2193,12 @@
           <w:ilvl w:val="0"/>
           <w:numId w:val="17"/>
         </w:numPr>
+        <w:spacing w:after="0"/>
       </w:pPr>
       <w:r>
+        <w:rPr>
+          <w:sz w:val="19"/>
+        </w:rPr>
         <w:t>Se diseña la arquitectura documental, Constitución y gobernanza.</w:t>
       </w:r>
     </w:p>
@@ -1711,8 +2209,12 @@
           <w:ilvl w:val="0"/>
           <w:numId w:val="17"/>
         </w:numPr>
+        <w:spacing w:after="0"/>
       </w:pPr>
       <w:r>
+        <w:rPr>
+          <w:sz w:val="19"/>
+        </w:rPr>
         <w:t>Se profesionaliza el repositorio con Git, releases, CHANGELOG y baselines.</w:t>
       </w:r>
     </w:p>
@@ -1723,8 +2225,12 @@
           <w:ilvl w:val="0"/>
           <w:numId w:val="17"/>
         </w:numPr>
+        <w:spacing w:after="0"/>
       </w:pPr>
       <w:r>
+        <w:rPr>
+          <w:sz w:val="19"/>
+        </w:rPr>
         <w:t>EPIC-001 crea el MetaModel y Knowledge Graph.</w:t>
       </w:r>
     </w:p>
@@ -1735,8 +2241,12 @@
           <w:ilvl w:val="0"/>
           <w:numId w:val="17"/>
         </w:numPr>
+        <w:spacing w:after="0"/>
       </w:pPr>
       <w:r>
+        <w:rPr>
+          <w:sz w:val="19"/>
+        </w:rPr>
         <w:t>D-006 se congela como Ontology Baseline v0.1.</w:t>
       </w:r>
     </w:p>
@@ -1747,8 +2257,12 @@
           <w:ilvl w:val="0"/>
           <w:numId w:val="17"/>
         </w:numPr>
+        <w:spacing w:after="0"/>
       </w:pPr>
       <w:r>
+        <w:rPr>
+          <w:sz w:val="19"/>
+        </w:rPr>
         <w:t>EPIC-002 crea el lenguaje universal de procesos.</w:t>
       </w:r>
     </w:p>
@@ -1759,8 +2273,12 @@
           <w:ilvl w:val="0"/>
           <w:numId w:val="17"/>
         </w:numPr>
+        <w:spacing w:after="0"/>
       </w:pPr>
       <w:r>
+        <w:rPr>
+          <w:sz w:val="19"/>
+        </w:rPr>
         <w:t>D-008 cierra B1 y congela P1–P9.</w:t>
       </w:r>
     </w:p>
@@ -1771,8 +2289,12 @@
           <w:ilvl w:val="0"/>
           <w:numId w:val="17"/>
         </w:numPr>
+        <w:spacing w:after="0"/>
       </w:pPr>
       <w:r>
+        <w:rPr>
+          <w:sz w:val="19"/>
+        </w:rPr>
         <w:t>D-017 cierra B2 y congela la taxonomía facetada.</w:t>
       </w:r>
     </w:p>
@@ -1783,8 +2305,12 @@
           <w:ilvl w:val="0"/>
           <w:numId w:val="17"/>
         </w:numPr>
+        <w:spacing w:after="0"/>
       </w:pPr>
       <w:r>
+        <w:rPr>
+          <w:sz w:val="19"/>
+        </w:rPr>
         <w:t>D-018 cierra B3 y congela 31 candidatos KPI.</w:t>
       </w:r>
     </w:p>
@@ -1795,8 +2321,12 @@
           <w:ilvl w:val="0"/>
           <w:numId w:val="17"/>
         </w:numPr>
+        <w:spacing w:after="0"/>
       </w:pPr>
       <w:r>
+        <w:rPr>
+          <w:sz w:val="19"/>
+        </w:rPr>
         <w:t>D-009–D-016 resuelven la arquitectura científica GTRM.</w:t>
       </w:r>
     </w:p>
@@ -1807,8 +2337,12 @@
           <w:ilvl w:val="0"/>
           <w:numId w:val="17"/>
         </w:numPr>
+        <w:spacing w:after="0"/>
       </w:pPr>
       <w:r>
+        <w:rPr>
+          <w:sz w:val="19"/>
+        </w:rPr>
         <w:t>GOEI-AUDIT-0007 declara B4 técnicamente preparada.</w:t>
       </w:r>
     </w:p>
@@ -1819,8 +2353,12 @@
           <w:ilvl w:val="0"/>
           <w:numId w:val="17"/>
         </w:numPr>
+        <w:spacing w:after="0"/>
       </w:pPr>
       <w:r>
+        <w:rPr>
+          <w:sz w:val="19"/>
+        </w:rPr>
         <w:t>Claude alcanza un límite de créditos durante el primer intento amplio de B4.</w:t>
       </w:r>
     </w:p>
@@ -1831,8 +2369,12 @@
           <w:ilvl w:val="0"/>
           <w:numId w:val="17"/>
         </w:numPr>
+        <w:spacing w:after="0"/>
       </w:pPr>
       <w:r>
+        <w:rPr>
+          <w:sz w:val="19"/>
+        </w:rPr>
         <w:t>Se adopta el protocolo de paquetes compactos y conversación nueva.</w:t>
       </w:r>
     </w:p>
@@ -1843,8 +2385,12 @@
           <w:ilvl w:val="0"/>
           <w:numId w:val="17"/>
         </w:numPr>
+        <w:spacing w:after="0"/>
       </w:pPr>
       <w:r>
+        <w:rPr>
+          <w:sz w:val="19"/>
+        </w:rPr>
         <w:t>La dirección automática queda pausada hasta nueva instrucción.</w:t>
       </w:r>
     </w:p>
@@ -1863,8 +2409,12 @@
           <w:ilvl w:val="0"/>
           <w:numId w:val="18"/>
         </w:numPr>
+        <w:spacing w:after="0"/>
       </w:pPr>
       <w:r>
+        <w:rPr>
+          <w:sz w:val="19"/>
+        </w:rPr>
         <w:t>00_Gobernanza/Constitucion_GOEI.md</w:t>
       </w:r>
     </w:p>
@@ -1875,8 +2425,12 @@
           <w:ilvl w:val="0"/>
           <w:numId w:val="18"/>
         </w:numPr>
+        <w:spacing w:after="0"/>
       </w:pPr>
       <w:r>
+        <w:rPr>
+          <w:sz w:val="19"/>
+        </w:rPr>
         <w:t>00_Gobernanza/Registro_de_decisiones.md</w:t>
       </w:r>
     </w:p>
@@ -1887,8 +2441,12 @@
           <w:ilvl w:val="0"/>
           <w:numId w:val="18"/>
         </w:numPr>
+        <w:spacing w:after="0"/>
       </w:pPr>
       <w:r>
+        <w:rPr>
+          <w:sz w:val="19"/>
+        </w:rPr>
         <w:t>00_Gobernanza/Registro_de_directivas.md</w:t>
       </w:r>
     </w:p>
@@ -1899,8 +2457,12 @@
           <w:ilvl w:val="0"/>
           <w:numId w:val="18"/>
         </w:numPr>
+        <w:spacing w:after="0"/>
       </w:pPr>
       <w:r>
+        <w:rPr>
+          <w:sz w:val="19"/>
+        </w:rPr>
         <w:t>00_Gobernanza/Preguntas_abiertas.md</w:t>
       </w:r>
     </w:p>
@@ -1911,8 +2473,12 @@
           <w:ilvl w:val="0"/>
           <w:numId w:val="18"/>
         </w:numPr>
+        <w:spacing w:after="0"/>
       </w:pPr>
       <w:r>
+        <w:rPr>
+          <w:sz w:val="19"/>
+        </w:rPr>
         <w:t>00_Gobernanza/Matriz_de_trazabilidad.md</w:t>
       </w:r>
     </w:p>
@@ -1923,8 +2489,12 @@
           <w:ilvl w:val="0"/>
           <w:numId w:val="18"/>
         </w:numPr>
+        <w:spacing w:after="0"/>
       </w:pPr>
       <w:r>
+        <w:rPr>
+          <w:sz w:val="19"/>
+        </w:rPr>
         <w:t>00_Gobernanza/coordinacion/ESTADO_MAESTRO.md</w:t>
       </w:r>
     </w:p>
@@ -1935,8 +2505,12 @@
           <w:ilvl w:val="0"/>
           <w:numId w:val="18"/>
         </w:numPr>
+        <w:spacing w:after="0"/>
       </w:pPr>
       <w:r>
+        <w:rPr>
+          <w:sz w:val="19"/>
+        </w:rPr>
         <w:t>00_Gobernanza/coordinacion/PIPELINE_B2_B10.md</w:t>
       </w:r>
     </w:p>
@@ -1947,8 +2521,12 @@
           <w:ilvl w:val="0"/>
           <w:numId w:val="18"/>
         </w:numPr>
+        <w:spacing w:after="0"/>
       </w:pPr>
       <w:r>
+        <w:rPr>
+          <w:sz w:val="19"/>
+        </w:rPr>
         <w:t>00_Gobernanza/coordinacion/resoluciones/GOEI_DIR_RES_0001_D008_B1.md</w:t>
       </w:r>
     </w:p>
@@ -1959,8 +2537,12 @@
           <w:ilvl w:val="0"/>
           <w:numId w:val="18"/>
         </w:numPr>
+        <w:spacing w:after="0"/>
       </w:pPr>
       <w:r>
+        <w:rPr>
+          <w:sz w:val="19"/>
+        </w:rPr>
         <w:t>00_Gobernanza/coordinacion/resoluciones/GOEI_DIR_RES_0002_D017_B2.md</w:t>
       </w:r>
     </w:p>
@@ -1971,8 +2553,12 @@
           <w:ilvl w:val="0"/>
           <w:numId w:val="18"/>
         </w:numPr>
+        <w:spacing w:after="0"/>
       </w:pPr>
       <w:r>
+        <w:rPr>
+          <w:sz w:val="19"/>
+        </w:rPr>
         <w:t>00_Gobernanza/coordinacion/resoluciones/GOEI_DIR_RES_0003_D018_B3.md</w:t>
       </w:r>
     </w:p>
@@ -1983,8 +2569,12 @@
           <w:ilvl w:val="0"/>
           <w:numId w:val="18"/>
         </w:numPr>
+        <w:spacing w:after="0"/>
       </w:pPr>
       <w:r>
+        <w:rPr>
+          <w:sz w:val="19"/>
+        </w:rPr>
         <w:t>00_Gobernanza/coordinacion/auditorias/GOEI_AUDIT_0007_B4_Readiness.md</w:t>
       </w:r>
     </w:p>
@@ -1995,8 +2585,12 @@
           <w:ilvl w:val="0"/>
           <w:numId w:val="18"/>
         </w:numPr>
+        <w:spacing w:after="0"/>
       </w:pPr>
       <w:r>
+        <w:rPr>
+          <w:sz w:val="19"/>
+        </w:rPr>
         <w:t>09_Manual_tecnico_general/Fase4_D006_Ontologia_del_GOEI.md</w:t>
       </w:r>
     </w:p>
@@ -2007,8 +2601,12 @@
           <w:ilvl w:val="0"/>
           <w:numId w:val="18"/>
         </w:numPr>
+        <w:spacing w:after="0"/>
       </w:pPr>
       <w:r>
+        <w:rPr>
+          <w:sz w:val="19"/>
+        </w:rPr>
         <w:t>04_Procesos_gastronomicos/EPIC-002_GOEI_Universal_Process_MetaModel.md</w:t>
       </w:r>
     </w:p>
@@ -2019,8 +2617,12 @@
           <w:ilvl w:val="0"/>
           <w:numId w:val="18"/>
         </w:numPr>
+        <w:spacing w:after="0"/>
       </w:pPr>
       <w:r>
+        <w:rPr>
+          <w:sz w:val="19"/>
+        </w:rPr>
         <w:t>03_Taxonomia_negocios/FaseB_B2_Taxonomia_universal_candidata.md</w:t>
       </w:r>
     </w:p>
@@ -2031,8 +2633,12 @@
           <w:ilvl w:val="0"/>
           <w:numId w:val="18"/>
         </w:numPr>
+        <w:spacing w:after="0"/>
       </w:pPr>
       <w:r>
+        <w:rPr>
+          <w:sz w:val="19"/>
+        </w:rPr>
         <w:t>05_Catalogo_KPI/GOEI_Catalogo_KPI_Candidatos_B3.md</w:t>
       </w:r>
     </w:p>
@@ -2043,8 +2649,12 @@
           <w:ilvl w:val="0"/>
           <w:numId w:val="18"/>
         </w:numPr>
+        <w:spacing w:after="0"/>
       </w:pPr>
       <w:r>
+        <w:rPr>
+          <w:sz w:val="19"/>
+        </w:rPr>
         <w:t>00_Gobernanza/coordinacion/decisiones_cientificas/GTRM/GOEI_CC_DICTAMEN_GTRM_INTEGRACION.md</w:t>
       </w:r>
     </w:p>
@@ -2055,8 +2665,12 @@
           <w:ilvl w:val="0"/>
           <w:numId w:val="18"/>
         </w:numPr>
+        <w:spacing w:after="0"/>
       </w:pPr>
       <w:r>
+        <w:rPr>
+          <w:sz w:val="19"/>
+        </w:rPr>
         <w:t>09_Manual_tecnico_general/GOEI_BOK/README.md</w:t>
       </w:r>
     </w:p>
@@ -2067,8 +2681,12 @@
           <w:ilvl w:val="0"/>
           <w:numId w:val="18"/>
         </w:numPr>
+        <w:spacing w:after="0"/>
       </w:pPr>
       <w:r>
+        <w:rPr>
+          <w:sz w:val="19"/>
+        </w:rPr>
         <w:t>12_Tesis/PLAN_MAESTRO_TESIS_GOEI.md</w:t>
       </w:r>
     </w:p>
@@ -2079,21 +2697,13 @@
           <w:ilvl w:val="0"/>
           <w:numId w:val="18"/>
         </w:numPr>
+        <w:spacing w:after="0"/>
       </w:pPr>
       <w:r>
+        <w:rPr>
+          <w:sz w:val="19"/>
+        </w:rPr>
         <w:t>12_Tesis/GOEI_Matriz_Requisitos_Tesis.csv</w:t>
-      </w:r>
-    </w:p>
-    <w:p>
-      <w:pPr>
-        <w:pStyle w:val="ListNumber"/>
-        <w:numPr>
-          <w:ilvl w:val="0"/>
-          <w:numId w:val="18"/>
-        </w:numPr>
-      </w:pPr>
-      <w:r>
-        <w:t>CHANGELOG.md</w:t>
       </w:r>
     </w:p>
     <w:sectPr>

</xml_diff>

<commit_message>
docs(thesis): replace project diagrams with methodology visuals
</commit_message>
<xml_diff>
--- a/12_Tesis/GOEI_Documento_de_Lectura_Proyecto_2026-08-04.docx
+++ b/12_Tesis/GOEI_Documento_de_Lectura_Proyecto_2026-08-04.docx
@@ -84,7 +84,7 @@
       <w:r>
         <w:drawing>
           <wp:inline xmlns:a="http://schemas.openxmlformats.org/drawingml/2006/main" xmlns:pic="http://schemas.openxmlformats.org/drawingml/2006/picture">
-            <wp:extent cx="6172200" cy="3506932"/>
+            <wp:extent cx="6172200" cy="4114800"/>
             <wp:docPr id="1" name="Picture 1"/>
             <wp:cNvGraphicFramePr>
               <a:graphicFrameLocks noChangeAspect="1"/>
@@ -93,7 +93,7 @@
               <a:graphicData uri="http://schemas.openxmlformats.org/drawingml/2006/picture">
                 <pic:pic>
                   <pic:nvPicPr>
-                    <pic:cNvPr id="0" name="01_mapa_mental_goei.png"/>
+                    <pic:cNvPr id="0" name="01_mapa_mental_metodologia_goei.png"/>
                     <pic:cNvPicPr/>
                   </pic:nvPicPr>
                   <pic:blipFill>
@@ -105,7 +105,7 @@
                   <pic:spPr>
                     <a:xfrm>
                       <a:off x="0" y="0"/>
-                      <a:ext cx="6172200" cy="3506932"/>
+                      <a:ext cx="6172200" cy="4114800"/>
                     </a:xfrm>
                     <a:prstGeom prst="rect"/>
                   </pic:spPr>
@@ -127,7 +127,7 @@
           <w:color w:val="595959"/>
           <w:sz w:val="18"/>
         </w:rPr>
-        <w:t>Mapa mental general del proyecto GOEI</w:t>
+        <w:t>Mapa mental de la metodología sustantiva del GOEI</w:t>
       </w:r>
     </w:p>
     <w:p>
@@ -236,13 +236,229 @@
     </w:p>
     <w:p>
       <w:pPr>
+        <w:widowControl/>
+      </w:pPr>
+      <w:r>
+        <w:t>La estructura institucional acordada ubica a Pablo Toledo Salinas como Director General. Bajo esa dirección funciona el Comité Directivo. El trabajo se divide entre el Comité Científico, representado operativamente por Claude, y la Oficina Técnica, representada por Codex.</w:t>
+      </w:r>
+    </w:p>
+    <w:p>
+      <w:pPr>
+        <w:widowControl/>
+      </w:pPr>
+      <w:r>
+        <w:t>El Comité Científico investiga, interpreta evidencia, evalúa alternativas metodológicas y propone decisiones. La Oficina Técnica transforma el conocimiento aprobado en componentes mantenibles: organiza documentos, controla configuraciones, registra decisiones e Issues, crea baselines, mantiene el Knowledge Graph, genera diagramas, integra manuales, administra Git y comprueba consistencia.</w:t>
+      </w:r>
+    </w:p>
+    <w:p>
+      <w:pPr>
+        <w:widowControl/>
+      </w:pPr>
+      <w:r>
+        <w:t>La separación no es decorativa. Codex no debe inventar KPI, fórmulas, ponderaciones, umbrales o conclusiones metodológicas. Cuando falta una decisión científica, la Oficina Técnica registra el vacío, documenta su impacto y bloquea únicamente la rama afectada. El resto del trabajo debe continuar.</w:t>
+      </w:r>
+    </w:p>
+    <w:p>
+      <w:pPr>
+        <w:widowControl/>
+      </w:pPr>
+      <w:r>
+        <w:t>Posteriormente, mediante GOEI-DIR-0004, la Dirección General delegó en Codex la conducción operativa dentro del marco aprobado. Esto permite organizar el trabajo, emitir actos directivos de cierre e integrar resultados sin solicitar validaciones intermedias al usuario. La delegación no convierte a Codex en autoridad científica: las decisiones metodológicas siguen necesitando un expediente atribuible al Comité Científico.</w:t>
+      </w:r>
+    </w:p>
+    <w:p>
+      <w:pPr>
+        <w:widowControl/>
+      </w:pPr>
+      <w:r>
+        <w:t>En agosto de 2026 la dirección automática quedó pausada por instrucción del Director General. Cuando se reactive, deberá abrirse una conversación nueva con Claude y utilizar paquetes de contexto compactos. Esta medida responde al consumo excesivo de tokens observado en sesiones previas.</w:t>
+      </w:r>
+    </w:p>
+    <w:p>
+      <w:pPr>
+        <w:pStyle w:val="Heading2"/>
+      </w:pPr>
+      <w:r>
+        <w:t>4. La Constitución y la arquitectura documental</w:t>
+      </w:r>
+    </w:p>
+    <w:p>
+      <w:pPr>
+        <w:widowControl/>
+      </w:pPr>
+      <w:r>
+        <w:t>Antes de desarrollar el contenido del estándar se diseñó una Constitución GOEI. El documento fundador organiza visión, misión, propósito, principios, alcance, objetivos, reglas metodológicas, gobernanza, jerarquía documental, ciclo de vida, incorporación de decisiones, modificación del estándar y definiciones generales.</w:t>
+      </w:r>
+    </w:p>
+    <w:p>
+      <w:pPr>
+        <w:widowControl/>
+      </w:pPr>
+      <w:r>
+        <w:t>La Constitución no pretende resolver el contenido científico. Establece las reglas mediante las cuales dicho contenido podrá ser aceptado, modificado o retirado. Esa distinción protege al proyecto de convertir preferencias operativas en reglas científicas por simple edición de documentos.</w:t>
+      </w:r>
+    </w:p>
+    <w:p>
+      <w:pPr>
+        <w:widowControl/>
+      </w:pPr>
+      <w:r>
+        <w:t>El repositorio se organizó para conservar gobernanza, investigación, bibliografía, taxonomía, procesos, KPI, normalización, ponderación y fórmula, interpretación, manuales, validación, tesis, publicaciones, anexos, mantenimiento y herramientas. A esa estructura se sumaron registros maestros de decisiones, directivas, componentes, Issues, preguntas abiertas, trazabilidad, versiones, baselines y cambios.</w:t>
+      </w:r>
+    </w:p>
+    <w:p>
+      <w:pPr>
+        <w:widowControl/>
+      </w:pPr>
+      <w:r>
+        <w:t>Git se utiliza como sistema de configuración, no solo como respaldo. Los commits describen cambios intencionales; las baselines congelan conjuntos de artefactos; los manifiestos conservan tamaños y huellas SHA-256; las releases deben superar compuertas de integridad, decisión y aprobación. Un archivo presente en el repositorio no se considera automáticamente aprobado.</w:t>
+      </w:r>
+    </w:p>
+    <w:p>
+      <w:pPr>
+        <w:pStyle w:val="Heading2"/>
+      </w:pPr>
+      <w:r>
+        <w:t>5. El Knowledge Graph y el MetaModel</w:t>
+      </w:r>
+    </w:p>
+    <w:p>
+      <w:pPr>
+        <w:widowControl/>
+      </w:pPr>
+      <w:r>
+        <w:t>Cuando el proyecto superó la fase inicial de organización documental se abrió EPIC-001: GOEI Knowledge Graph &amp; MetaModel. El objetivo fue representar el origen y las dependencias de cualquier elemento del estándar.</w:t>
+      </w:r>
+    </w:p>
+    <w:p>
+      <w:pPr>
+        <w:widowControl/>
+      </w:pPr>
+      <w:r>
+        <w:t>El metamodelo incluye entidades como evidencia, fuente bibliográfica, investigación, hipótesis, pregunta abierta, observación, debate científico, decisión científica, revisión técnica, componente, documento, manual, ontología, taxonomía, proceso, KPI, regla, fórmula, validación, publicación, tesis, versión, registro de cambio, Issue, Constitución y Body of Knowledge.</w:t>
+      </w:r>
+    </w:p>
+    <w:p>
+      <w:pPr>
+        <w:widowControl/>
+      </w:pPr>
+      <w:r>
+        <w:t>La utilidad del grafo se entiende mediante relaciones sencillas: una evidencia sustenta una decisión; una decisión crea o modifica un componente; un componente pertenece a un documento; un documento integra una versión del estándar; una baseline congela determinados artefactos; un Issue bloquea una rama; una validación evalúa un componente o una versión.</w:t>
+      </w:r>
+    </w:p>
+    <w:p>
+      <w:pPr>
+        <w:widowControl/>
+      </w:pPr>
+      <w:r>
+        <w:t>El proyecto dispone de diccionarios de entidades y relaciones, reglas de integridad, restricciones de consistencia, reglas de navegación, diagramas, matriz entidad-relación y una proyección procesable en JSON. La proyección actual se valida automáticamente y mantiene 236 nodos y 292 relaciones.</w:t>
+      </w:r>
+    </w:p>
+    <w:p>
+      <w:pPr>
+        <w:widowControl/>
+      </w:pPr>
+      <w:r>
+        <w:t>El Knowledge Graph no determina si una afirmación científica es correcta. Su función es impedir que una conclusión pierda su procedencia o que una modificación se propague de forma invisible.</w:t>
+      </w:r>
+    </w:p>
+    <w:p>
+      <w:pPr>
+        <w:pStyle w:val="Heading2"/>
+      </w:pPr>
+      <w:r>
+        <w:t>6. D-006: la ontología conceptual congelada</w:t>
+      </w:r>
+    </w:p>
+    <w:p>
+      <w:pPr>
+        <w:widowControl/>
+      </w:pPr>
+      <w:r>
+        <w:t>La primera versión de la ontología conceptual fue desarrollada y validada metodológicamente por el Comité Científico. La Oficina Técnica la revisó desde la arquitectura de conocimiento: consistencia interna, terminología, separación entre metamodelo, tipos e instancias, redundancias, relaciones, restricciones, escalabilidad y compatibilidad futura con software, formularios y motor matemático.</w:t>
+      </w:r>
+    </w:p>
+    <w:p>
+      <w:pPr>
+        <w:widowControl/>
+      </w:pPr>
+      <w:r>
+        <w:t>Después de esa revisión se ordenó congelar D-006 como Ontology Baseline v0.1. Desde ese momento ninguna modificación puede realizarse silenciosamente. Todo cambio requiere un Issue formal, análisis de impacto, decisión competente, nueva versión y preservación de la versión anterior.</w:t>
+      </w:r>
+    </w:p>
+    <w:p>
+      <w:pPr>
+        <w:widowControl/>
+      </w:pPr>
+      <w:r>
+        <w:t>Esta baseline es provisional en el sentido evolutivo de cualquier estándar, pero es inmutable como registro histórico. Existe un candidato de ontología v0.2.0 relacionado con la arquitectura GTRM; no reemplaza a D-006. GOEI-ISS-053 conserva abierta la posible ampliación futura.</w:t>
+      </w:r>
+    </w:p>
+    <w:p>
+      <w:pPr>
+        <w:widowControl/>
+      </w:pPr>
+      <w:r>
+        <w:t>La ontología también fijó separaciones que luego resultaron esenciales: un fenómeno real no es idéntico a la observación que lo representa; una observación no es lo mismo que una medición registrada; un valor KPI es una derivación; una puntuación normalizada pertenece a una fase posterior. Sin esa separación el futuro software podría mezclar datos originales, cálculos y resultados interpretados.</w:t>
+      </w:r>
+    </w:p>
+    <w:p>
+      <w:pPr>
+        <w:pStyle w:val="Heading2"/>
+      </w:pPr>
+      <w:r>
+        <w:t>7. EPIC-002 y el lenguaje universal de procesos</w:t>
+      </w:r>
+    </w:p>
+    <w:p>
+      <w:pPr>
+        <w:widowControl/>
+      </w:pPr>
+      <w:r>
+        <w:t>EPIC-002 se inició para crear el MetaModelo Universal de Procesos. El encargo no consistía en investigar qué procesos gastronómicos existen, sino en diseñar el lenguaje capaz de representarlos.</w:t>
+      </w:r>
+    </w:p>
+    <w:p>
+      <w:pPr>
+        <w:widowControl/>
+      </w:pPr>
+      <w:r>
+        <w:t>El metamodelo contempla proceso, subproceso, actividad, evento, entrada, salida, recurso, agente, restricción, evidencia, observación, riesgo, control, documento, registro e indicador. Para cada entidad se diseñaron propósito, atributos, relaciones, cardinalidades, restricciones y ciclo de vida.</w:t>
+      </w:r>
+    </w:p>
+    <w:p>
+      <w:pPr>
+        <w:widowControl/>
+      </w:pPr>
+      <w:r>
+        <w:t>También se construyeron diagramas UML, matrices de relaciones, reglas de integridad y correspondencias con BPMN y ArchiMate. El resultado permite que un proceso aprobado pueda representarse tanto en documentación manual como en una implementación informática sin convertir una notación externa en la autoridad normativa del GOEI.</w:t>
+      </w:r>
+    </w:p>
+    <w:p>
+      <w:pPr>
+        <w:widowControl/>
+      </w:pPr>
+      <w:r>
+        <w:t>Esta fase dejó preparado el lenguaje. La identificación científica de los procesos universales se resolvió después, dentro de B1.</w:t>
+      </w:r>
+    </w:p>
+    <w:p>
+      <w:pPr>
+        <w:pStyle w:val="Heading2"/>
+      </w:pPr>
+      <w:r>
+        <w:t>8. B1 y D-008: el núcleo universal de procesos</w:t>
+      </w:r>
+    </w:p>
+    <w:p>
+      <w:pPr>
         <w:spacing w:before="120" w:after="60"/>
         <w:jc w:val="center"/>
       </w:pPr>
       <w:r>
         <w:drawing>
           <wp:inline xmlns:a="http://schemas.openxmlformats.org/drawingml/2006/main" xmlns:pic="http://schemas.openxmlformats.org/drawingml/2006/picture">
-            <wp:extent cx="6172200" cy="3506932"/>
+            <wp:extent cx="6172200" cy="3473708"/>
             <wp:docPr id="2" name="Picture 2"/>
             <wp:cNvGraphicFramePr>
               <a:graphicFrameLocks noChangeAspect="1"/>
@@ -251,7 +467,7 @@
               <a:graphicData uri="http://schemas.openxmlformats.org/drawingml/2006/picture">
                 <pic:pic>
                   <pic:nvPicPr>
-                    <pic:cNvPr id="0" name="02_mapa_autoridad.png"/>
+                    <pic:cNvPr id="0" name="02_operaciones_goei_p1_p9.png"/>
                     <pic:cNvPicPr/>
                   </pic:nvPicPr>
                   <pic:blipFill>
@@ -263,7 +479,7 @@
                   <pic:spPr>
                     <a:xfrm>
                       <a:off x="0" y="0"/>
-                      <a:ext cx="6172200" cy="3506932"/>
+                      <a:ext cx="6172200" cy="3473708"/>
                     </a:xfrm>
                     <a:prstGeom prst="rect"/>
                   </pic:spPr>
@@ -285,7 +501,7 @@
           <w:color w:val="595959"/>
           <w:sz w:val="18"/>
         </w:rPr>
-        <w:t>Autoridad y separación de responsabilidades</w:t>
+        <w:t>Arquitectura operacional universal y lenguaje de modelado</w:t>
       </w:r>
     </w:p>
     <w:p>
@@ -293,7 +509,7 @@
         <w:widowControl/>
       </w:pPr>
       <w:r>
-        <w:t>La estructura institucional acordada ubica a Pablo Toledo Salinas como Director General. Bajo esa dirección funciona el Comité Directivo. El trabajo se divide entre el Comité Científico, representado operativamente por Claude, y la Oficina Técnica, representada por Codex.</w:t>
+        <w:t>La pregunta de B1 fue si existe un conjunto de procesos común a los establecimientos gastronómicos. El Comité examinó modelos de sistemas de foodservice, cadenas operacionales, hotelería, catering, delivery y sistemas de producción.</w:t>
       </w:r>
     </w:p>
     <w:p>
@@ -301,7 +517,7 @@
         <w:widowControl/>
       </w:pPr>
       <w:r>
-        <w:t>El Comité Científico investiga, interpreta evidencia, evalúa alternativas metodológicas y propone decisiones. La Oficina Técnica transforma el conocimiento aprobado en componentes mantenibles: organiza documentos, controla configuraciones, registra decisiones e Issues, crea baselines, mantiene el Knowledge Graph, genera diagramas, integra manuales, administra Git y comprueba consistencia.</w:t>
+        <w:t>La conclusión no fue que todos los establecimientos realicen las mismas actividades concretas. Una dark kitchen, un casino de alimentación y un restaurante de mesa pueden ejecutar tareas diferentes. La decisión D-008 estableció un núcleo universal a nivel de subsistema funcional, cuyas realizaciones específicas podrán variar según categoría o sistema.</w:t>
       </w:r>
     </w:p>
     <w:p>
@@ -309,82 +525,338 @@
         <w:widowControl/>
       </w:pPr>
       <w:r>
-        <w:t>La separación no es decorativa. Codex no debe inventar KPI, fórmulas, ponderaciones, umbrales o conclusiones metodológicas. Cuando falta una decisión científica, la Oficina Técnica registra el vacío, documenta su impacto y bloquea únicamente la rama afectada. El resto del trabajo debe continuar.</w:t>
+        <w:t>El núcleo quedó organizado como una cadena primaria P1–P6 y planos transversales P7–P9:</w:t>
       </w:r>
     </w:p>
     <w:p>
       <w:pPr>
-        <w:widowControl/>
+        <w:pStyle w:val="ListNumber"/>
+        <w:numPr>
+          <w:ilvl w:val="0"/>
+          <w:numId w:val="10"/>
+        </w:numPr>
       </w:pPr>
       <w:r>
-        <w:t>Posteriormente, mediante GOEI-DIR-0004, la Dirección General delegó en Codex la conducción operativa dentro del marco aprobado. Esto permite organizar el trabajo, emitir actos directivos de cierre e integrar resultados sin solicitar validaciones intermedias al usuario. La delegación no convierte a Codex en autoridad científica: las decisiones metodológicas siguen necesitando un expediente atribuible al Comité Científico.</w:t>
+        <w:t>P1: planificación y menú o demanda.</w:t>
       </w:r>
     </w:p>
     <w:p>
       <w:pPr>
-        <w:widowControl/>
+        <w:pStyle w:val="ListNumber"/>
+        <w:numPr>
+          <w:ilvl w:val="0"/>
+          <w:numId w:val="10"/>
+        </w:numPr>
       </w:pPr>
       <w:r>
-        <w:t>En agosto de 2026 la dirección automática quedó pausada por instrucción del Director General. Cuando se reactive, deberá abrirse una conversación nueva con Claude y utilizar paquetes de contexto compactos. Esta medida responde al consumo excesivo de tokens observado en sesiones previas.</w:t>
+        <w:t>P2: aprovisionamiento.</w:t>
       </w:r>
     </w:p>
     <w:p>
       <w:pPr>
-        <w:pStyle w:val="Heading2"/>
+        <w:pStyle w:val="ListNumber"/>
+        <w:numPr>
+          <w:ilvl w:val="0"/>
+          <w:numId w:val="10"/>
+        </w:numPr>
       </w:pPr>
       <w:r>
-        <w:t>4. La Constitución y la arquitectura documental</w:t>
+        <w:t>P3: recepción, almacenamiento e inventario.</w:t>
       </w:r>
     </w:p>
     <w:p>
       <w:pPr>
-        <w:widowControl/>
+        <w:pStyle w:val="ListNumber"/>
+        <w:numPr>
+          <w:ilvl w:val="0"/>
+          <w:numId w:val="10"/>
+        </w:numPr>
       </w:pPr>
       <w:r>
-        <w:t>Antes de desarrollar el contenido del estándar se diseñó una Constitución GOEI. El documento fundador organiza visión, misión, propósito, principios, alcance, objetivos, reglas metodológicas, gobernanza, jerarquía documental, ciclo de vida, incorporación de decisiones, modificación del estándar y definiciones generales.</w:t>
+        <w:t>P4: producción o preparación.</w:t>
       </w:r>
     </w:p>
     <w:p>
       <w:pPr>
-        <w:widowControl/>
+        <w:pStyle w:val="ListNumber"/>
+        <w:numPr>
+          <w:ilvl w:val="0"/>
+          <w:numId w:val="10"/>
+        </w:numPr>
       </w:pPr>
       <w:r>
-        <w:t>La Constitución no pretende resolver el contenido científico. Establece las reglas mediante las cuales dicho contenido podrá ser aceptado, modificado o retirado. Esa distinción protege al proyecto de convertir preferencias operativas en reglas científicas por simple edición de documentos.</w:t>
+        <w:t>P5: distribución, servicio o cumplimiento.</w:t>
       </w:r>
     </w:p>
     <w:p>
       <w:pPr>
-        <w:widowControl/>
+        <w:pStyle w:val="ListNumber"/>
+        <w:numPr>
+          <w:ilvl w:val="0"/>
+          <w:numId w:val="10"/>
+        </w:numPr>
       </w:pPr>
       <w:r>
-        <w:t>El repositorio se organizó para conservar gobernanza, investigación, bibliografía, taxonomía, procesos, KPI, normalización, ponderación y fórmula, interpretación, manuales, validación, tesis, publicaciones, anexos, mantenimiento y herramientas. A esa estructura se sumaron registros maestros de decisiones, directivas, componentes, Issues, preguntas abiertas, trazabilidad, versiones, baselines y cambios.</w:t>
+        <w:t>P6: transacción y cierre.</w:t>
       </w:r>
     </w:p>
     <w:p>
       <w:pPr>
-        <w:widowControl/>
+        <w:pStyle w:val="ListNumber"/>
+        <w:numPr>
+          <w:ilvl w:val="0"/>
+          <w:numId w:val="10"/>
+        </w:numPr>
       </w:pPr>
       <w:r>
-        <w:t>Git se utiliza como sistema de configuración, no solo como respaldo. Los commits describen cambios intencionales; las baselines congelan conjuntos de artefactos; los manifiestos conservan tamaños y huellas SHA-256; las releases deben superar compuertas de integridad, decisión y aprobación. Un archivo presente en el repositorio no se considera automáticamente aprobado.</w:t>
+        <w:t>P7: inocuidad e higiene.</w:t>
       </w:r>
     </w:p>
     <w:p>
       <w:pPr>
-        <w:pStyle w:val="Heading2"/>
+        <w:pStyle w:val="ListNumber"/>
+        <w:numPr>
+          <w:ilvl w:val="0"/>
+          <w:numId w:val="10"/>
+        </w:numPr>
       </w:pPr>
       <w:r>
-        <w:t>5. El Knowledge Graph y el MetaModel</w:t>
+        <w:t>P8: mantenimiento.</w:t>
       </w:r>
     </w:p>
     <w:p>
       <w:pPr>
+        <w:pStyle w:val="ListNumber"/>
+        <w:numPr>
+          <w:ilvl w:val="0"/>
+          <w:numId w:val="10"/>
+        </w:numPr>
+      </w:pPr>
+      <w:r>
+        <w:t>P9: gestión.</w:t>
+      </w:r>
+    </w:p>
+    <w:p>
+      <w:pPr>
+        <w:widowControl/>
+      </w:pPr>
+      <w:r>
+        <w:t>D-008 cerró únicamente la pregunta nuclear. No determinó todos los subprocesos, actividades o variantes. Tampoco convirtió residuos o merma en un macroproceso normativo. Los asuntos todavía dependientes de investigación permanecieron registrados como Issues.</w:t>
+      </w:r>
+    </w:p>
+    <w:p>
+      <w:pPr>
+        <w:widowControl/>
+      </w:pPr>
+      <w:r>
+        <w:t>La Dirección ratificó D-008 mediante GOEI-DIR-RES-0001 y congeló GOEI-BSL-PROC-0001 v0.1.0. Esa baseline habilitó la fase B2.</w:t>
+      </w:r>
+    </w:p>
+    <w:p>
+      <w:pPr>
+        <w:pStyle w:val="Heading2"/>
+      </w:pPr>
+      <w:r>
+        <w:t>9. B2 y D-017: una taxonomía facetada</w:t>
+      </w:r>
+    </w:p>
+    <w:p>
+      <w:pPr>
+        <w:widowControl/>
+      </w:pPr>
+      <w:r>
+        <w:t>La taxonomía debía evitar dos errores: asumir categorías rígidas sin evidencia suficiente o tratar todos los negocios como comparables. El Comité concluyó que la estructura más escalable era un modelo multieje o facetado.</w:t>
+      </w:r>
+    </w:p>
+    <w:p>
+      <w:pPr>
+        <w:widowControl/>
+      </w:pPr>
+      <w:r>
+        <w:t>D-017 estableció como unidad ordinaria el Establecimiento. Una categoría se representa como combinación de facetas, no como una etiqueta aislada. Se aprobaron tres identidades de faceta:</w:t>
+      </w:r>
+    </w:p>
+    <w:p>
+      <w:pPr>
+        <w:pStyle w:val="ListNumber"/>
+        <w:numPr>
+          <w:ilvl w:val="0"/>
+          <w:numId w:val="11"/>
+        </w:numPr>
+      </w:pPr>
+      <w:r>
+        <w:t>FX-1: modalidad de servicio o entrega.</w:t>
+      </w:r>
+    </w:p>
+    <w:p>
+      <w:pPr>
+        <w:pStyle w:val="ListNumber"/>
+        <w:numPr>
+          <w:ilvl w:val="0"/>
+          <w:numId w:val="11"/>
+        </w:numPr>
+      </w:pPr>
+      <w:r>
+        <w:t>FX-2: sistema de producción.</w:t>
+      </w:r>
+    </w:p>
+    <w:p>
+      <w:pPr>
+        <w:pStyle w:val="ListNumber"/>
+        <w:numPr>
+          <w:ilvl w:val="0"/>
+          <w:numId w:val="11"/>
+        </w:numPr>
+      </w:pPr>
+      <w:r>
+        <w:t>FX-3: naturaleza económica.</w:t>
+      </w:r>
+    </w:p>
+    <w:p>
+      <w:pPr>
+        <w:widowControl/>
+      </w:pPr>
+      <w:r>
+        <w:t>También se reconocieron relaciones estructurales entre FX-1 y P5, FX-2 y P4/P5, y FX-3 y P6. Estas relaciones indican dónde una faceta puede condicionar la realización de un proceso.</w:t>
+      </w:r>
+    </w:p>
+    <w:p>
+      <w:pPr>
+        <w:widowControl/>
+      </w:pPr>
+      <w:r>
+        <w:t>La decisión no aprobó valores concretos de cada faceta. No existe todavía una lista normativa definitiva de categorías, cardinalidades, combinaciones híbridas, reglas para establecimientos multiunidad o correspondencias externas. Estos elementos permanecen bajo GOEI-ISS-008 y GOEI-ISS-054.</w:t>
+      </w:r>
+    </w:p>
+    <w:p>
+      <w:pPr>
+        <w:widowControl/>
+      </w:pPr>
+      <w:r>
+        <w:t>La Dirección ratificó D-017 mediante GOEI-DIR-RES-0002 y congeló GOEI-BSL-TAX-0001 v0.1.0. Con ello se abrió B3.</w:t>
+      </w:r>
+    </w:p>
+    <w:p>
+      <w:pPr>
+        <w:pStyle w:val="Heading2"/>
+      </w:pPr>
+      <w:r>
+        <w:t>10. B3 y D-018: el universo candidato de KPI</w:t>
+      </w:r>
+    </w:p>
+    <w:p>
+      <w:pPr>
+        <w:widowControl/>
+      </w:pPr>
+      <w:r>
+        <w:t>B3 tuvo un alcance deliberadamente limitado: identificar indicadores documentados que pudieran representar P1–P9 y las facetas aprobadas. La fase no debía decidir admisibilidad, fórmula, ponderación, puntuación, referencia o normalización.</w:t>
+      </w:r>
+    </w:p>
+    <w:p>
+      <w:pPr>
+        <w:widowControl/>
+      </w:pPr>
+      <w:r>
+        <w:t>El Comité produjo una revisión, un catálogo candidato, una matriz de cobertura y el handoff científico D-018. Inicialmente se registraron 32 elementos. La auditoría técnica determinó que C-032, Balanced Scorecard, era un marco contextual y no un indicador. Por ello la baseline se cerró con 31 candidatos evaluables y C-032 quedó conservado fuera de la cola KPI.</w:t>
+      </w:r>
+    </w:p>
+    <w:p>
+      <w:pPr>
+        <w:widowControl/>
+      </w:pPr>
+      <w:r>
+        <w:t>Aceptar el universo candidato no significa aprobar los KPI. Cada ficha conserva nombre fuente, definición encontrada, unidad, fórmula solo cuando la fuente la proporciona, proceso relacionado, alcance de faceta, procedencia bibliográfica, datos requeridos, frecuencia cuando consta, limitaciones, duplicados y estado candidato.</w:t>
+      </w:r>
+    </w:p>
+    <w:p>
+      <w:pPr>
+        <w:widowControl/>
+      </w:pPr>
+      <w:r>
+        <w:t>La cobertura es desigual. Existen candidatos para los nueve procesos, pero P1 mantiene un vacío relacionado con una métrica cerrada de exactitud del pronóstico específica de foodservice. También existen indicadores procedentes de marcos genéricos cuya adaptación al contexto gastronómico no ha sido resuelta.</w:t>
+      </w:r>
+    </w:p>
+    <w:p>
+      <w:pPr>
+        <w:widowControl/>
+      </w:pPr>
+      <w:r>
+        <w:t>D-018 abrió GOEI-ISS-055 a GOEI-ISS-058:</w:t>
+      </w:r>
+    </w:p>
+    <w:p>
+      <w:pPr>
+        <w:pStyle w:val="ListNumber"/>
+        <w:numPr>
+          <w:ilvl w:val="0"/>
+          <w:numId w:val="12"/>
+        </w:numPr>
+      </w:pPr>
+      <w:r>
+        <w:t>ISS-055 impide afirmar que el universo sea exhaustivo sin una revisión sistemática suficiente.</w:t>
+      </w:r>
+    </w:p>
+    <w:p>
+      <w:pPr>
+        <w:pStyle w:val="ListNumber"/>
+        <w:numPr>
+          <w:ilvl w:val="0"/>
+          <w:numId w:val="12"/>
+        </w:numPr>
+      </w:pPr>
+      <w:r>
+        <w:t>ISS-056 bloquea selectivamente la rama de exactitud de pronóstico de C-003.</w:t>
+      </w:r>
+    </w:p>
+    <w:p>
+      <w:pPr>
+        <w:pStyle w:val="ListNumber"/>
+        <w:numPr>
+          <w:ilvl w:val="0"/>
+          <w:numId w:val="12"/>
+        </w:numPr>
+      </w:pPr>
+      <w:r>
+        <w:t>ISS-057 afecta la adaptación gastronómica de candidatos derivados de SCOR e ISO 30414.</w:t>
+      </w:r>
+    </w:p>
+    <w:p>
+      <w:pPr>
+        <w:pStyle w:val="ListNumber"/>
+        <w:numPr>
+          <w:ilvl w:val="0"/>
+          <w:numId w:val="12"/>
+        </w:numPr>
+      </w:pPr>
+      <w:r>
+        <w:t>ISS-058 conserva abierta la comparabilidad jurisdiccional de inspecciones sanitarias.</w:t>
+      </w:r>
+    </w:p>
+    <w:p>
+      <w:pPr>
+        <w:widowControl/>
+      </w:pPr>
+      <w:r>
+        <w:t>La Dirección ratificó D-018 mediante GOEI-DIR-RES-0003 y congeló GOEI-BSL-KPI-C-0001 v0.1.0. B3 quedó cerrada en su pregunta nuclear y B4 fue habilitada.</w:t>
+      </w:r>
+    </w:p>
+    <w:p>
+      <w:pPr>
+        <w:pStyle w:val="Heading2"/>
+      </w:pPr>
+      <w:r>
+        <w:t>11. La ampliación GTRM</w:t>
+      </w:r>
+    </w:p>
+    <w:p>
+      <w:pPr>
         <w:spacing w:before="120" w:after="60"/>
         <w:jc w:val="center"/>
       </w:pPr>
       <w:r>
         <w:drawing>
           <wp:inline xmlns:a="http://schemas.openxmlformats.org/drawingml/2006/main" xmlns:pic="http://schemas.openxmlformats.org/drawingml/2006/picture">
-            <wp:extent cx="6172200" cy="3506932"/>
+            <wp:extent cx="6172200" cy="3473708"/>
             <wp:docPr id="3" name="Picture 3"/>
             <wp:cNvGraphicFramePr>
               <a:graphicFrameLocks noChangeAspect="1"/>
@@ -393,7 +865,7 @@
               <a:graphicData uri="http://schemas.openxmlformats.org/drawingml/2006/picture">
                 <pic:pic>
                   <pic:nvPicPr>
-                    <pic:cNvPr id="0" name="03_flujo_trazabilidad.png"/>
+                    <pic:cNvPr id="0" name="03_observacion_interpretacion_goei.png"/>
                     <pic:cNvPicPr/>
                   </pic:nvPicPr>
                   <pic:blipFill>
@@ -405,7 +877,7 @@
                   <pic:spPr>
                     <a:xfrm>
                       <a:off x="0" y="0"/>
-                      <a:ext cx="6172200" cy="3506932"/>
+                      <a:ext cx="6172200" cy="3473708"/>
                     </a:xfrm>
                     <a:prstGeom prst="rect"/>
                   </pic:spPr>
@@ -427,7 +899,7 @@
           <w:color w:val="595959"/>
           <w:sz w:val="18"/>
         </w:rPr>
-        <w:t>Cadena de trazabilidad del conocimiento</w:t>
+        <w:t>Cadena metodológica desde la observación hasta la interpretación</w:t>
       </w:r>
     </w:p>
     <w:p>
@@ -435,7 +907,7 @@
         <w:widowControl/>
       </w:pPr>
       <w:r>
-        <w:t>Cuando el proyecto superó la fase inicial de organización documental se abrió EPIC-001: GOEI Knowledge Graph &amp; MetaModel. El objetivo fue representar el origen y las dependencias de cualquier elemento del estándar.</w:t>
+        <w:t>Durante el proyecto se propuso una arquitectura denominada Gastronomic Technical Reference Matrix o GTRM. La propuesta podía afectar medición, referencias, normalización, software, formularios y taxonomía. Por eso no se incorporó directamente: se abrió una auditoría científica y técnica.</w:t>
       </w:r>
     </w:p>
     <w:p>
@@ -443,87 +915,127 @@
         <w:widowControl/>
       </w:pPr>
       <w:r>
-        <w:t>El metamodelo incluye entidades como evidencia, fuente bibliográfica, investigación, hipótesis, pregunta abierta, observación, debate científico, decisión científica, revisión técnica, componente, documento, manual, ontología, taxonomía, proceso, KPI, regla, fórmula, validación, publicación, tesis, versión, registro de cambio, Issue, Constitución y Body of Knowledge.</w:t>
+        <w:t>La auditoría exigió distinguir diez conceptos:</w:t>
       </w:r>
     </w:p>
     <w:p>
       <w:pPr>
-        <w:widowControl/>
+        <w:pStyle w:val="ListNumber"/>
+        <w:numPr>
+          <w:ilvl w:val="0"/>
+          <w:numId w:val="13"/>
+        </w:numPr>
       </w:pPr>
       <w:r>
-        <w:t>La utilidad del grafo se entiende mediante relaciones sencillas: una evidencia sustenta una decisión; una decisión crea o modifica un componente; un componente pertenece a un documento; un documento integra una versión del estándar; una baseline congela determinados artefactos; un Issue bloquea una rama; una validación evalúa un componente o una versión.</w:t>
+        <w:t>Observación: representación de un fenómeno o evento observado.</w:t>
       </w:r>
     </w:p>
     <w:p>
       <w:pPr>
-        <w:widowControl/>
+        <w:pStyle w:val="ListNumber"/>
+        <w:numPr>
+          <w:ilvl w:val="0"/>
+          <w:numId w:val="13"/>
+        </w:numPr>
       </w:pPr>
       <w:r>
-        <w:t>El proyecto dispone de diccionarios de entidades y relaciones, reglas de integridad, restricciones de consistencia, reglas de navegación, diagramas, matriz entidad-relación y una proyección procesable en JSON. La proyección actual se valida automáticamente y mantiene 236 nodos y 292 relaciones.</w:t>
+        <w:t>Medición registrada: dato conservado con instrumento, unidad, método, agente y periodo.</w:t>
       </w:r>
     </w:p>
     <w:p>
       <w:pPr>
-        <w:widowControl/>
+        <w:pStyle w:val="ListNumber"/>
+        <w:numPr>
+          <w:ilvl w:val="0"/>
+          <w:numId w:val="13"/>
+        </w:numPr>
       </w:pPr>
       <w:r>
-        <w:t>El Knowledge Graph no determina si una afirmación científica es correcta. Su función es impedir que una conclusión pierda su procedencia o que una modificación se propague de forma invisible.</w:t>
+        <w:t>Valor de KPI: resultado derivado de mediciones válidas.</w:t>
       </w:r>
     </w:p>
     <w:p>
       <w:pPr>
-        <w:pStyle w:val="Heading2"/>
+        <w:pStyle w:val="ListNumber"/>
+        <w:numPr>
+          <w:ilvl w:val="0"/>
+          <w:numId w:val="13"/>
+        </w:numPr>
       </w:pPr>
       <w:r>
-        <w:t>6. D-006: la ontología conceptual congelada</w:t>
+        <w:t>Condición de referencia: estado normativo, regulatorio o empírico utilizado como patrón.</w:t>
       </w:r>
     </w:p>
     <w:p>
       <w:pPr>
-        <w:widowControl/>
+        <w:pStyle w:val="ListNumber"/>
+        <w:numPr>
+          <w:ilvl w:val="0"/>
+          <w:numId w:val="13"/>
+        </w:numPr>
       </w:pPr>
       <w:r>
-        <w:t>La primera versión de la ontología conceptual fue desarrollada y validada metodológicamente por el Comité Científico. La Oficina Técnica la revisó desde la arquitectura de conocimiento: consistencia interna, terminología, separación entre metamodelo, tipos e instancias, redundancias, relaciones, restricciones, escalabilidad y compatibilidad futura con software, formularios y motor matemático.</w:t>
+        <w:t>Benchmark: valor o distribución comparativa correspondiente a una población, categoría, jurisdicción y periodo.</w:t>
       </w:r>
     </w:p>
     <w:p>
       <w:pPr>
-        <w:widowControl/>
+        <w:pStyle w:val="ListNumber"/>
+        <w:numPr>
+          <w:ilvl w:val="0"/>
+          <w:numId w:val="13"/>
+        </w:numPr>
       </w:pPr>
       <w:r>
-        <w:t>Después de esa revisión se ordenó congelar D-006 como Ontology Baseline v0.1. Desde ese momento ninguna modificación puede realizarse silenciosamente. Todo cambio requiere un Issue formal, análisis de impacto, decisión competente, nueva versión y preservación de la versión anterior.</w:t>
+        <w:t>Función de puntuación: transformación que utiliza el valor KPI y sus referencias.</w:t>
       </w:r>
     </w:p>
     <w:p>
       <w:pPr>
-        <w:widowControl/>
+        <w:pStyle w:val="ListNumber"/>
+        <w:numPr>
+          <w:ilvl w:val="0"/>
+          <w:numId w:val="13"/>
+        </w:numPr>
       </w:pPr>
       <w:r>
-        <w:t>Esta baseline es provisional en el sentido evolutivo de cualquier estándar, pero es inmutable como registro histórico. Existe un candidato de ontología v0.2.0 relacionado con la arquitectura GTRM; no reemplaza a D-006. GOEI-ISS-053 conserva abierta la posible ampliación futura.</w:t>
+        <w:t>Normalización: operación que hace comparables escalas heterogéneas.</w:t>
       </w:r>
     </w:p>
     <w:p>
       <w:pPr>
-        <w:widowControl/>
+        <w:pStyle w:val="ListNumber"/>
+        <w:numPr>
+          <w:ilvl w:val="0"/>
+          <w:numId w:val="13"/>
+        </w:numPr>
       </w:pPr>
       <w:r>
-        <w:t>La ontología también fijó separaciones que luego resultaron esenciales: un fenómeno real no es idéntico a la observación que lo representa; una observación no es lo mismo que una medición registrada; un valor KPI es una derivación; una puntuación normalizada pertenece a una fase posterior. Sin esa separación el futuro software podría mezclar datos originales, cálculos y resultados interpretados.</w:t>
+        <w:t>Puntuación normalizada: salida de la transformación en una escala común.</w:t>
       </w:r>
     </w:p>
     <w:p>
       <w:pPr>
-        <w:pStyle w:val="Heading2"/>
+        <w:pStyle w:val="ListNumber"/>
+        <w:numPr>
+          <w:ilvl w:val="0"/>
+          <w:numId w:val="13"/>
+        </w:numPr>
       </w:pPr>
       <w:r>
-        <w:t>7. EPIC-002 y el lenguaje universal de procesos</w:t>
+        <w:t>Tabla de consulta manual: representación fiel de la función para papel y calculadora.</w:t>
       </w:r>
     </w:p>
     <w:p>
       <w:pPr>
-        <w:widowControl/>
+        <w:pStyle w:val="ListNumber"/>
+        <w:numPr>
+          <w:ilvl w:val="0"/>
+          <w:numId w:val="13"/>
+        </w:numPr>
       </w:pPr>
       <w:r>
-        <w:t>EPIC-002 se inició para crear el MetaModelo Universal de Procesos. El encargo no consistía en investigar qué procesos gastronómicos existen, sino en diseñar el lenguaje capaz de representarlos.</w:t>
+        <w:t>Interpretación: significado permitido de la puntuación y límites de las conclusiones.</w:t>
       </w:r>
     </w:p>
     <w:p>
@@ -531,7 +1043,7 @@
         <w:widowControl/>
       </w:pPr>
       <w:r>
-        <w:t>El metamodelo contempla proceso, subproceso, actividad, evento, entrada, salida, recurso, agente, restricción, evidencia, observación, riesgo, control, documento, registro e indicador. Para cada entidad se diseñaron propósito, atributos, relaciones, cardinalidades, restricciones y ciclo de vida.</w:t>
+        <w:t>Las decisiones D-009 a D-016 concluyeron que la GTRM actúa sobre un valor KPI ya derivado, no sobre observaciones brutas. Se definió como una función normativa parametrizada cuya aplicación produce la puntuación normalizada del KPI. Por tanto, no debe existir una segunda normalización que transforme nuevamente el resultado.</w:t>
       </w:r>
     </w:p>
     <w:p>
@@ -539,7 +1051,7 @@
         <w:widowControl/>
       </w:pPr>
       <w:r>
-        <w:t>También se construyeron diagramas UML, matrices de relaciones, reglas de integridad y correspondencias con BPMN y ArchiMate. El resultado permite que un proceso aprobado pueda representarse tanto en documentación manual como en una implementación informática sin convertir una notación externa en la autoridad normativa del GOEI.</w:t>
+        <w:t>La condición de referencia y el benchmark son entidades diferentes. Pueden existir referencias universales, regulatorias, jurisdiccionales o específicas, pero su selección no puede ser inferida por el software cuando falta una regla aprobada. Si no existe una referencia válida o existe un conflicto no resuelto, el resultado debe quedar no calculable y generar un Issue selectivo.</w:t>
       </w:r>
     </w:p>
     <w:p>
@@ -547,26 +1059,42 @@
         <w:widowControl/>
       </w:pPr>
       <w:r>
-        <w:t>Esta fase dejó preparado el lenguaje. La identificación científica de los procesos universales se resolvió después, dentro de B1.</w:t>
+        <w:t>La incertidumbre debe conservar fuentes separadas: medición, muestreo, benchmark, parámetros y puntuación. Todavía no se ha aprobado un método concreto para representarla en cada KPI.</w:t>
       </w:r>
     </w:p>
     <w:p>
       <w:pPr>
-        <w:pStyle w:val="Heading2"/>
+        <w:widowControl/>
       </w:pPr>
       <w:r>
-        <w:t>8. B1 y D-008: el núcleo universal de procesos</w:t>
+        <w:t>La tabla manual y el código serán dos representaciones de la misma especificación normativa. Ninguno puede convertirse en una fuente independiente. Cada evaluación deberá conservar versión de GTRM, función, parámetros, referencias, fecha de vigencia, precisión, redondeo, entradas originales, salida e incertidumbre. Una versión sustituida no se sobrescribirá.</w:t>
       </w:r>
     </w:p>
     <w:p>
       <w:pPr>
+        <w:widowControl/>
+      </w:pPr>
+      <w:r>
+        <w:t>La Dirección adoptó la resolución GTRM y cerró ISS-044 únicamente respecto de su ubicación arquitectónica. Los Issues posteriores conservan abiertos los aspectos científicos o implementaciones concretas. D-006 no fue alterada; cualquier incorporación definitiva requiere ISS-053 y nueva versión ontológica.</w:t>
+      </w:r>
+    </w:p>
+    <w:p>
+      <w:pPr>
+        <w:pStyle w:val="Heading2"/>
+      </w:pPr>
+      <w:r>
+        <w:t>12. B4: el punto exacto donde está detenido el trabajo científico</w:t>
+      </w:r>
+    </w:p>
+    <w:p>
+      <w:pPr>
         <w:spacing w:before="120" w:after="60"/>
         <w:jc w:val="center"/>
       </w:pPr>
       <w:r>
         <w:drawing>
           <wp:inline xmlns:a="http://schemas.openxmlformats.org/drawingml/2006/main" xmlns:pic="http://schemas.openxmlformats.org/drawingml/2006/picture">
-            <wp:extent cx="6172200" cy="3506932"/>
+            <wp:extent cx="6172200" cy="3473708"/>
             <wp:docPr id="4" name="Picture 4"/>
             <wp:cNvGraphicFramePr>
               <a:graphicFrameLocks noChangeAspect="1"/>
@@ -575,7 +1103,7 @@
               <a:graphicData uri="http://schemas.openxmlformats.org/drawingml/2006/picture">
                 <pic:pic>
                   <pic:nvPicPr>
-                    <pic:cNvPr id="0" name="04_mapa_operacional_p1_p9.png"/>
+                    <pic:cNvPr id="0" name="04_construccion_metodologica_b1_b10.png"/>
                     <pic:cNvPicPr/>
                   </pic:nvPicPr>
                   <pic:blipFill>
@@ -587,7 +1115,7 @@
                   <pic:spPr>
                     <a:xfrm>
                       <a:off x="0" y="0"/>
-                      <a:ext cx="6172200" cy="3506932"/>
+                      <a:ext cx="6172200" cy="3473708"/>
                     </a:xfrm>
                     <a:prstGeom prst="rect"/>
                   </pic:spPr>
@@ -609,697 +1137,7 @@
           <w:color w:val="595959"/>
           <w:sz w:val="18"/>
         </w:rPr>
-        <w:t>Mapa operacional universal P1–P9</w:t>
-      </w:r>
-    </w:p>
-    <w:p>
-      <w:pPr>
-        <w:widowControl/>
-      </w:pPr>
-      <w:r>
-        <w:t>La pregunta de B1 fue si existe un conjunto de procesos común a los establecimientos gastronómicos. El Comité examinó modelos de sistemas de foodservice, cadenas operacionales, hotelería, catering, delivery y sistemas de producción.</w:t>
-      </w:r>
-    </w:p>
-    <w:p>
-      <w:pPr>
-        <w:widowControl/>
-      </w:pPr>
-      <w:r>
-        <w:t>La conclusión no fue que todos los establecimientos realicen las mismas actividades concretas. Una dark kitchen, un casino de alimentación y un restaurante de mesa pueden ejecutar tareas diferentes. La decisión D-008 estableció un núcleo universal a nivel de subsistema funcional, cuyas realizaciones específicas podrán variar según categoría o sistema.</w:t>
-      </w:r>
-    </w:p>
-    <w:p>
-      <w:pPr>
-        <w:widowControl/>
-      </w:pPr>
-      <w:r>
-        <w:t>El núcleo quedó organizado como una cadena primaria P1–P6 y planos transversales P7–P9:</w:t>
-      </w:r>
-    </w:p>
-    <w:p>
-      <w:pPr>
-        <w:pStyle w:val="ListNumber"/>
-        <w:numPr>
-          <w:ilvl w:val="0"/>
-          <w:numId w:val="10"/>
-        </w:numPr>
-      </w:pPr>
-      <w:r>
-        <w:t>P1: planificación y menú o demanda.</w:t>
-      </w:r>
-    </w:p>
-    <w:p>
-      <w:pPr>
-        <w:pStyle w:val="ListNumber"/>
-        <w:numPr>
-          <w:ilvl w:val="0"/>
-          <w:numId w:val="10"/>
-        </w:numPr>
-      </w:pPr>
-      <w:r>
-        <w:t>P2: aprovisionamiento.</w:t>
-      </w:r>
-    </w:p>
-    <w:p>
-      <w:pPr>
-        <w:pStyle w:val="ListNumber"/>
-        <w:numPr>
-          <w:ilvl w:val="0"/>
-          <w:numId w:val="10"/>
-        </w:numPr>
-      </w:pPr>
-      <w:r>
-        <w:t>P3: recepción, almacenamiento e inventario.</w:t>
-      </w:r>
-    </w:p>
-    <w:p>
-      <w:pPr>
-        <w:pStyle w:val="ListNumber"/>
-        <w:numPr>
-          <w:ilvl w:val="0"/>
-          <w:numId w:val="10"/>
-        </w:numPr>
-      </w:pPr>
-      <w:r>
-        <w:t>P4: producción o preparación.</w:t>
-      </w:r>
-    </w:p>
-    <w:p>
-      <w:pPr>
-        <w:pStyle w:val="ListNumber"/>
-        <w:numPr>
-          <w:ilvl w:val="0"/>
-          <w:numId w:val="10"/>
-        </w:numPr>
-      </w:pPr>
-      <w:r>
-        <w:t>P5: distribución, servicio o cumplimiento.</w:t>
-      </w:r>
-    </w:p>
-    <w:p>
-      <w:pPr>
-        <w:pStyle w:val="ListNumber"/>
-        <w:numPr>
-          <w:ilvl w:val="0"/>
-          <w:numId w:val="10"/>
-        </w:numPr>
-      </w:pPr>
-      <w:r>
-        <w:t>P6: transacción y cierre.</w:t>
-      </w:r>
-    </w:p>
-    <w:p>
-      <w:pPr>
-        <w:pStyle w:val="ListNumber"/>
-        <w:numPr>
-          <w:ilvl w:val="0"/>
-          <w:numId w:val="10"/>
-        </w:numPr>
-      </w:pPr>
-      <w:r>
-        <w:t>P7: inocuidad e higiene.</w:t>
-      </w:r>
-    </w:p>
-    <w:p>
-      <w:pPr>
-        <w:pStyle w:val="ListNumber"/>
-        <w:numPr>
-          <w:ilvl w:val="0"/>
-          <w:numId w:val="10"/>
-        </w:numPr>
-      </w:pPr>
-      <w:r>
-        <w:t>P8: mantenimiento.</w:t>
-      </w:r>
-    </w:p>
-    <w:p>
-      <w:pPr>
-        <w:pStyle w:val="ListNumber"/>
-        <w:numPr>
-          <w:ilvl w:val="0"/>
-          <w:numId w:val="10"/>
-        </w:numPr>
-      </w:pPr>
-      <w:r>
-        <w:t>P9: gestión.</w:t>
-      </w:r>
-    </w:p>
-    <w:p>
-      <w:pPr>
-        <w:widowControl/>
-      </w:pPr>
-      <w:r>
-        <w:t>D-008 cerró únicamente la pregunta nuclear. No determinó todos los subprocesos, actividades o variantes. Tampoco convirtió residuos o merma en un macroproceso normativo. Los asuntos todavía dependientes de investigación permanecieron registrados como Issues.</w:t>
-      </w:r>
-    </w:p>
-    <w:p>
-      <w:pPr>
-        <w:widowControl/>
-      </w:pPr>
-      <w:r>
-        <w:t>La Dirección ratificó D-008 mediante GOEI-DIR-RES-0001 y congeló GOEI-BSL-PROC-0001 v0.1.0. Esa baseline habilitó la fase B2.</w:t>
-      </w:r>
-    </w:p>
-    <w:p>
-      <w:pPr>
-        <w:pStyle w:val="Heading2"/>
-      </w:pPr>
-      <w:r>
-        <w:t>9. B2 y D-017: una taxonomía facetada</w:t>
-      </w:r>
-    </w:p>
-    <w:p>
-      <w:pPr>
-        <w:widowControl/>
-      </w:pPr>
-      <w:r>
-        <w:t>La taxonomía debía evitar dos errores: asumir categorías rígidas sin evidencia suficiente o tratar todos los negocios como comparables. El Comité concluyó que la estructura más escalable era un modelo multieje o facetado.</w:t>
-      </w:r>
-    </w:p>
-    <w:p>
-      <w:pPr>
-        <w:widowControl/>
-      </w:pPr>
-      <w:r>
-        <w:t>D-017 estableció como unidad ordinaria el Establecimiento. Una categoría se representa como combinación de facetas, no como una etiqueta aislada. Se aprobaron tres identidades de faceta:</w:t>
-      </w:r>
-    </w:p>
-    <w:p>
-      <w:pPr>
-        <w:pStyle w:val="ListNumber"/>
-        <w:numPr>
-          <w:ilvl w:val="0"/>
-          <w:numId w:val="11"/>
-        </w:numPr>
-      </w:pPr>
-      <w:r>
-        <w:t>FX-1: modalidad de servicio o entrega.</w:t>
-      </w:r>
-    </w:p>
-    <w:p>
-      <w:pPr>
-        <w:pStyle w:val="ListNumber"/>
-        <w:numPr>
-          <w:ilvl w:val="0"/>
-          <w:numId w:val="11"/>
-        </w:numPr>
-      </w:pPr>
-      <w:r>
-        <w:t>FX-2: sistema de producción.</w:t>
-      </w:r>
-    </w:p>
-    <w:p>
-      <w:pPr>
-        <w:pStyle w:val="ListNumber"/>
-        <w:numPr>
-          <w:ilvl w:val="0"/>
-          <w:numId w:val="11"/>
-        </w:numPr>
-      </w:pPr>
-      <w:r>
-        <w:t>FX-3: naturaleza económica.</w:t>
-      </w:r>
-    </w:p>
-    <w:p>
-      <w:pPr>
-        <w:widowControl/>
-      </w:pPr>
-      <w:r>
-        <w:t>También se reconocieron relaciones estructurales entre FX-1 y P5, FX-2 y P4/P5, y FX-3 y P6. Estas relaciones indican dónde una faceta puede condicionar la realización de un proceso.</w:t>
-      </w:r>
-    </w:p>
-    <w:p>
-      <w:pPr>
-        <w:widowControl/>
-      </w:pPr>
-      <w:r>
-        <w:t>La decisión no aprobó valores concretos de cada faceta. No existe todavía una lista normativa definitiva de categorías, cardinalidades, combinaciones híbridas, reglas para establecimientos multiunidad o correspondencias externas. Estos elementos permanecen bajo GOEI-ISS-008 y GOEI-ISS-054.</w:t>
-      </w:r>
-    </w:p>
-    <w:p>
-      <w:pPr>
-        <w:widowControl/>
-      </w:pPr>
-      <w:r>
-        <w:t>La Dirección ratificó D-017 mediante GOEI-DIR-RES-0002 y congeló GOEI-BSL-TAX-0001 v0.1.0. Con ello se abrió B3.</w:t>
-      </w:r>
-    </w:p>
-    <w:p>
-      <w:pPr>
-        <w:pStyle w:val="Heading2"/>
-      </w:pPr>
-      <w:r>
-        <w:t>10. B3 y D-018: el universo candidato de KPI</w:t>
-      </w:r>
-    </w:p>
-    <w:p>
-      <w:pPr>
-        <w:widowControl/>
-      </w:pPr>
-      <w:r>
-        <w:t>B3 tuvo un alcance deliberadamente limitado: identificar indicadores documentados que pudieran representar P1–P9 y las facetas aprobadas. La fase no debía decidir admisibilidad, fórmula, ponderación, puntuación, referencia o normalización.</w:t>
-      </w:r>
-    </w:p>
-    <w:p>
-      <w:pPr>
-        <w:widowControl/>
-      </w:pPr>
-      <w:r>
-        <w:t>El Comité produjo una revisión, un catálogo candidato, una matriz de cobertura y el handoff científico D-018. Inicialmente se registraron 32 elementos. La auditoría técnica determinó que C-032, Balanced Scorecard, era un marco contextual y no un indicador. Por ello la baseline se cerró con 31 candidatos evaluables y C-032 quedó conservado fuera de la cola KPI.</w:t>
-      </w:r>
-    </w:p>
-    <w:p>
-      <w:pPr>
-        <w:widowControl/>
-      </w:pPr>
-      <w:r>
-        <w:t>Aceptar el universo candidato no significa aprobar los KPI. Cada ficha conserva nombre fuente, definición encontrada, unidad, fórmula solo cuando la fuente la proporciona, proceso relacionado, alcance de faceta, procedencia bibliográfica, datos requeridos, frecuencia cuando consta, limitaciones, duplicados y estado candidato.</w:t>
-      </w:r>
-    </w:p>
-    <w:p>
-      <w:pPr>
-        <w:widowControl/>
-      </w:pPr>
-      <w:r>
-        <w:t>La cobertura es desigual. Existen candidatos para los nueve procesos, pero P1 mantiene un vacío relacionado con una métrica cerrada de exactitud del pronóstico específica de foodservice. También existen indicadores procedentes de marcos genéricos cuya adaptación al contexto gastronómico no ha sido resuelta.</w:t>
-      </w:r>
-    </w:p>
-    <w:p>
-      <w:pPr>
-        <w:widowControl/>
-      </w:pPr>
-      <w:r>
-        <w:t>D-018 abrió GOEI-ISS-055 a GOEI-ISS-058:</w:t>
-      </w:r>
-    </w:p>
-    <w:p>
-      <w:pPr>
-        <w:pStyle w:val="ListNumber"/>
-        <w:numPr>
-          <w:ilvl w:val="0"/>
-          <w:numId w:val="12"/>
-        </w:numPr>
-      </w:pPr>
-      <w:r>
-        <w:t>ISS-055 impide afirmar que el universo sea exhaustivo sin una revisión sistemática suficiente.</w:t>
-      </w:r>
-    </w:p>
-    <w:p>
-      <w:pPr>
-        <w:pStyle w:val="ListNumber"/>
-        <w:numPr>
-          <w:ilvl w:val="0"/>
-          <w:numId w:val="12"/>
-        </w:numPr>
-      </w:pPr>
-      <w:r>
-        <w:t>ISS-056 bloquea selectivamente la rama de exactitud de pronóstico de C-003.</w:t>
-      </w:r>
-    </w:p>
-    <w:p>
-      <w:pPr>
-        <w:pStyle w:val="ListNumber"/>
-        <w:numPr>
-          <w:ilvl w:val="0"/>
-          <w:numId w:val="12"/>
-        </w:numPr>
-      </w:pPr>
-      <w:r>
-        <w:t>ISS-057 afecta la adaptación gastronómica de candidatos derivados de SCOR e ISO 30414.</w:t>
-      </w:r>
-    </w:p>
-    <w:p>
-      <w:pPr>
-        <w:pStyle w:val="ListNumber"/>
-        <w:numPr>
-          <w:ilvl w:val="0"/>
-          <w:numId w:val="12"/>
-        </w:numPr>
-      </w:pPr>
-      <w:r>
-        <w:t>ISS-058 conserva abierta la comparabilidad jurisdiccional de inspecciones sanitarias.</w:t>
-      </w:r>
-    </w:p>
-    <w:p>
-      <w:pPr>
-        <w:widowControl/>
-      </w:pPr>
-      <w:r>
-        <w:t>La Dirección ratificó D-018 mediante GOEI-DIR-RES-0003 y congeló GOEI-BSL-KPI-C-0001 v0.1.0. B3 quedó cerrada en su pregunta nuclear y B4 fue habilitada.</w:t>
-      </w:r>
-    </w:p>
-    <w:p>
-      <w:pPr>
-        <w:pStyle w:val="Heading2"/>
-      </w:pPr>
-      <w:r>
-        <w:t>11. La ampliación GTRM</w:t>
-      </w:r>
-    </w:p>
-    <w:p>
-      <w:pPr>
-        <w:spacing w:before="120" w:after="60"/>
-        <w:jc w:val="center"/>
-      </w:pPr>
-      <w:r>
-        <w:drawing>
-          <wp:inline xmlns:a="http://schemas.openxmlformats.org/drawingml/2006/main" xmlns:pic="http://schemas.openxmlformats.org/drawingml/2006/picture">
-            <wp:extent cx="6172200" cy="3506932"/>
-            <wp:docPr id="5" name="Picture 5"/>
-            <wp:cNvGraphicFramePr>
-              <a:graphicFrameLocks noChangeAspect="1"/>
-            </wp:cNvGraphicFramePr>
-            <a:graphic>
-              <a:graphicData uri="http://schemas.openxmlformats.org/drawingml/2006/picture">
-                <pic:pic>
-                  <pic:nvPicPr>
-                    <pic:cNvPr id="0" name="06_mapa_gtrm.png"/>
-                    <pic:cNvPicPr/>
-                  </pic:nvPicPr>
-                  <pic:blipFill>
-                    <a:blip r:embed="rId15"/>
-                    <a:stretch>
-                      <a:fillRect/>
-                    </a:stretch>
-                  </pic:blipFill>
-                  <pic:spPr>
-                    <a:xfrm>
-                      <a:off x="0" y="0"/>
-                      <a:ext cx="6172200" cy="3506932"/>
-                    </a:xfrm>
-                    <a:prstGeom prst="rect"/>
-                  </pic:spPr>
-                </pic:pic>
-              </a:graphicData>
-            </a:graphic>
-          </wp:inline>
-        </w:drawing>
-      </w:r>
-    </w:p>
-    <w:p>
-      <w:pPr>
-        <w:spacing w:after="200"/>
-        <w:jc w:val="center"/>
-      </w:pPr>
-      <w:r>
-        <w:rPr>
-          <w:i/>
-          <w:color w:val="595959"/>
-          <w:sz w:val="18"/>
-        </w:rPr>
-        <w:t>Transformación conceptual GTRM</w:t>
-      </w:r>
-    </w:p>
-    <w:p>
-      <w:pPr>
-        <w:widowControl/>
-      </w:pPr>
-      <w:r>
-        <w:t>Durante el proyecto se propuso una arquitectura denominada Gastronomic Technical Reference Matrix o GTRM. La propuesta podía afectar medición, referencias, normalización, software, formularios y taxonomía. Por eso no se incorporó directamente: se abrió una auditoría científica y técnica.</w:t>
-      </w:r>
-    </w:p>
-    <w:p>
-      <w:pPr>
-        <w:widowControl/>
-      </w:pPr>
-      <w:r>
-        <w:t>La auditoría exigió distinguir diez conceptos:</w:t>
-      </w:r>
-    </w:p>
-    <w:p>
-      <w:pPr>
-        <w:pStyle w:val="ListNumber"/>
-        <w:numPr>
-          <w:ilvl w:val="0"/>
-          <w:numId w:val="13"/>
-        </w:numPr>
-      </w:pPr>
-      <w:r>
-        <w:t>Observación: representación de un fenómeno o evento observado.</w:t>
-      </w:r>
-    </w:p>
-    <w:p>
-      <w:pPr>
-        <w:pStyle w:val="ListNumber"/>
-        <w:numPr>
-          <w:ilvl w:val="0"/>
-          <w:numId w:val="13"/>
-        </w:numPr>
-      </w:pPr>
-      <w:r>
-        <w:t>Medición registrada: dato conservado con instrumento, unidad, método, agente y periodo.</w:t>
-      </w:r>
-    </w:p>
-    <w:p>
-      <w:pPr>
-        <w:pStyle w:val="ListNumber"/>
-        <w:numPr>
-          <w:ilvl w:val="0"/>
-          <w:numId w:val="13"/>
-        </w:numPr>
-      </w:pPr>
-      <w:r>
-        <w:t>Valor de KPI: resultado derivado de mediciones válidas.</w:t>
-      </w:r>
-    </w:p>
-    <w:p>
-      <w:pPr>
-        <w:pStyle w:val="ListNumber"/>
-        <w:numPr>
-          <w:ilvl w:val="0"/>
-          <w:numId w:val="13"/>
-        </w:numPr>
-      </w:pPr>
-      <w:r>
-        <w:t>Condición de referencia: estado normativo, regulatorio o empírico utilizado como patrón.</w:t>
-      </w:r>
-    </w:p>
-    <w:p>
-      <w:pPr>
-        <w:pStyle w:val="ListNumber"/>
-        <w:numPr>
-          <w:ilvl w:val="0"/>
-          <w:numId w:val="13"/>
-        </w:numPr>
-      </w:pPr>
-      <w:r>
-        <w:t>Benchmark: valor o distribución comparativa correspondiente a una población, categoría, jurisdicción y periodo.</w:t>
-      </w:r>
-    </w:p>
-    <w:p>
-      <w:pPr>
-        <w:pStyle w:val="ListNumber"/>
-        <w:numPr>
-          <w:ilvl w:val="0"/>
-          <w:numId w:val="13"/>
-        </w:numPr>
-      </w:pPr>
-      <w:r>
-        <w:t>Función de puntuación: transformación que utiliza el valor KPI y sus referencias.</w:t>
-      </w:r>
-    </w:p>
-    <w:p>
-      <w:pPr>
-        <w:pStyle w:val="ListNumber"/>
-        <w:numPr>
-          <w:ilvl w:val="0"/>
-          <w:numId w:val="13"/>
-        </w:numPr>
-      </w:pPr>
-      <w:r>
-        <w:t>Normalización: operación que hace comparables escalas heterogéneas.</w:t>
-      </w:r>
-    </w:p>
-    <w:p>
-      <w:pPr>
-        <w:pStyle w:val="ListNumber"/>
-        <w:numPr>
-          <w:ilvl w:val="0"/>
-          <w:numId w:val="13"/>
-        </w:numPr>
-      </w:pPr>
-      <w:r>
-        <w:t>Puntuación normalizada: salida de la transformación en una escala común.</w:t>
-      </w:r>
-    </w:p>
-    <w:p>
-      <w:pPr>
-        <w:pStyle w:val="ListNumber"/>
-        <w:numPr>
-          <w:ilvl w:val="0"/>
-          <w:numId w:val="13"/>
-        </w:numPr>
-      </w:pPr>
-      <w:r>
-        <w:t>Tabla de consulta manual: representación fiel de la función para papel y calculadora.</w:t>
-      </w:r>
-    </w:p>
-    <w:p>
-      <w:pPr>
-        <w:pStyle w:val="ListNumber"/>
-        <w:numPr>
-          <w:ilvl w:val="0"/>
-          <w:numId w:val="13"/>
-        </w:numPr>
-      </w:pPr>
-      <w:r>
-        <w:t>Interpretación: significado permitido de la puntuación y límites de las conclusiones.</w:t>
-      </w:r>
-    </w:p>
-    <w:p>
-      <w:pPr>
-        <w:widowControl/>
-      </w:pPr>
-      <w:r>
-        <w:t>Las decisiones D-009 a D-016 concluyeron que la GTRM actúa sobre un valor KPI ya derivado, no sobre observaciones brutas. Se definió como una función normativa parametrizada cuya aplicación produce la puntuación normalizada del KPI. Por tanto, no debe existir una segunda normalización que transforme nuevamente el resultado.</w:t>
-      </w:r>
-    </w:p>
-    <w:p>
-      <w:pPr>
-        <w:widowControl/>
-      </w:pPr>
-      <w:r>
-        <w:t>La condición de referencia y el benchmark son entidades diferentes. Pueden existir referencias universales, regulatorias, jurisdiccionales o específicas, pero su selección no puede ser inferida por el software cuando falta una regla aprobada. Si no existe una referencia válida o existe un conflicto no resuelto, el resultado debe quedar no calculable y generar un Issue selectivo.</w:t>
-      </w:r>
-    </w:p>
-    <w:p>
-      <w:pPr>
-        <w:widowControl/>
-      </w:pPr>
-      <w:r>
-        <w:t>La incertidumbre debe conservar fuentes separadas: medición, muestreo, benchmark, parámetros y puntuación. Todavía no se ha aprobado un método concreto para representarla en cada KPI.</w:t>
-      </w:r>
-    </w:p>
-    <w:p>
-      <w:pPr>
-        <w:widowControl/>
-      </w:pPr>
-      <w:r>
-        <w:t>La tabla manual y el código serán dos representaciones de la misma especificación normativa. Ninguno puede convertirse en una fuente independiente. Cada evaluación deberá conservar versión de GTRM, función, parámetros, referencias, fecha de vigencia, precisión, redondeo, entradas originales, salida e incertidumbre. Una versión sustituida no se sobrescribirá.</w:t>
-      </w:r>
-    </w:p>
-    <w:p>
-      <w:pPr>
-        <w:widowControl/>
-      </w:pPr>
-      <w:r>
-        <w:t>La Dirección adoptó la resolución GTRM y cerró ISS-044 únicamente respecto de su ubicación arquitectónica. Los Issues posteriores conservan abiertos los aspectos científicos o implementaciones concretas. D-006 no fue alterada; cualquier incorporación definitiva requiere ISS-053 y nueva versión ontológica.</w:t>
-      </w:r>
-    </w:p>
-    <w:p>
-      <w:pPr>
-        <w:pStyle w:val="Heading2"/>
-      </w:pPr>
-      <w:r>
-        <w:t>12. B4: el punto exacto donde está detenido el trabajo científico</w:t>
-      </w:r>
-    </w:p>
-    <w:p>
-      <w:pPr>
-        <w:spacing w:before="120" w:after="60"/>
-        <w:jc w:val="center"/>
-      </w:pPr>
-      <w:r>
-        <w:drawing>
-          <wp:inline xmlns:a="http://schemas.openxmlformats.org/drawingml/2006/main" xmlns:pic="http://schemas.openxmlformats.org/drawingml/2006/picture">
-            <wp:extent cx="6172200" cy="3506932"/>
-            <wp:docPr id="6" name="Picture 6"/>
-            <wp:cNvGraphicFramePr>
-              <a:graphicFrameLocks noChangeAspect="1"/>
-            </wp:cNvGraphicFramePr>
-            <a:graphic>
-              <a:graphicData uri="http://schemas.openxmlformats.org/drawingml/2006/picture">
-                <pic:pic>
-                  <pic:nvPicPr>
-                    <pic:cNvPr id="0" name="05_linea_tiempo.png"/>
-                    <pic:cNvPicPr/>
-                  </pic:nvPicPr>
-                  <pic:blipFill>
-                    <a:blip r:embed="rId16"/>
-                    <a:stretch>
-                      <a:fillRect/>
-                    </a:stretch>
-                  </pic:blipFill>
-                  <pic:spPr>
-                    <a:xfrm>
-                      <a:off x="0" y="0"/>
-                      <a:ext cx="6172200" cy="3506932"/>
-                    </a:xfrm>
-                    <a:prstGeom prst="rect"/>
-                  </pic:spPr>
-                </pic:pic>
-              </a:graphicData>
-            </a:graphic>
-          </wp:inline>
-        </w:drawing>
-      </w:r>
-    </w:p>
-    <w:p>
-      <w:pPr>
-        <w:spacing w:after="200"/>
-        <w:jc w:val="center"/>
-      </w:pPr>
-      <w:r>
-        <w:rPr>
-          <w:i/>
-          <w:color w:val="595959"/>
-          <w:sz w:val="18"/>
-        </w:rPr>
-        <w:t>Línea temporal hasta D-019</w:t>
-      </w:r>
-    </w:p>
-    <w:p>
-      <w:pPr>
-        <w:spacing w:before="120" w:after="60"/>
-        <w:jc w:val="center"/>
-      </w:pPr>
-      <w:r>
-        <w:drawing>
-          <wp:inline xmlns:a="http://schemas.openxmlformats.org/drawingml/2006/main" xmlns:pic="http://schemas.openxmlformats.org/drawingml/2006/picture">
-            <wp:extent cx="6172200" cy="3506932"/>
-            <wp:docPr id="7" name="Picture 7"/>
-            <wp:cNvGraphicFramePr>
-              <a:graphicFrameLocks noChangeAspect="1"/>
-            </wp:cNvGraphicFramePr>
-            <a:graphic>
-              <a:graphicData uri="http://schemas.openxmlformats.org/drawingml/2006/picture">
-                <pic:pic>
-                  <pic:nvPicPr>
-                    <pic:cNvPr id="0" name="07_pipeline_b1_b10.png"/>
-                    <pic:cNvPicPr/>
-                  </pic:nvPicPr>
-                  <pic:blipFill>
-                    <a:blip r:embed="rId17"/>
-                    <a:stretch>
-                      <a:fillRect/>
-                    </a:stretch>
-                  </pic:blipFill>
-                  <pic:spPr>
-                    <a:xfrm>
-                      <a:off x="0" y="0"/>
-                      <a:ext cx="6172200" cy="3506932"/>
-                    </a:xfrm>
-                    <a:prstGeom prst="rect"/>
-                  </pic:spPr>
-                </pic:pic>
-              </a:graphicData>
-            </a:graphic>
-          </wp:inline>
-        </w:drawing>
-      </w:r>
-    </w:p>
-    <w:p>
-      <w:pPr>
-        <w:spacing w:after="200"/>
-        <w:jc w:val="center"/>
-      </w:pPr>
-      <w:r>
-        <w:rPr>
-          <w:i/>
-          <w:color w:val="595959"/>
-          <w:sz w:val="18"/>
-        </w:rPr>
-        <w:t>Pipeline operativo B1–B10</w:t>
+        <w:t>Construcción metodológica del estándar GOEI</w:t>
       </w:r>
     </w:p>
     <w:p>
@@ -1560,60 +1398,6 @@
     </w:p>
     <w:p>
       <w:pPr>
-        <w:spacing w:before="120" w:after="60"/>
-        <w:jc w:val="center"/>
-      </w:pPr>
-      <w:r>
-        <w:drawing>
-          <wp:inline xmlns:a="http://schemas.openxmlformats.org/drawingml/2006/main" xmlns:pic="http://schemas.openxmlformats.org/drawingml/2006/picture">
-            <wp:extent cx="6172200" cy="3506932"/>
-            <wp:docPr id="8" name="Picture 8"/>
-            <wp:cNvGraphicFramePr>
-              <a:graphicFrameLocks noChangeAspect="1"/>
-            </wp:cNvGraphicFramePr>
-            <a:graphic>
-              <a:graphicData uri="http://schemas.openxmlformats.org/drawingml/2006/picture">
-                <pic:pic>
-                  <pic:nvPicPr>
-                    <pic:cNvPr id="0" name="08_mapa_estado.png"/>
-                    <pic:cNvPicPr/>
-                  </pic:nvPicPr>
-                  <pic:blipFill>
-                    <a:blip r:embed="rId18"/>
-                    <a:stretch>
-                      <a:fillRect/>
-                    </a:stretch>
-                  </pic:blipFill>
-                  <pic:spPr>
-                    <a:xfrm>
-                      <a:off x="0" y="0"/>
-                      <a:ext cx="6172200" cy="3506932"/>
-                    </a:xfrm>
-                    <a:prstGeom prst="rect"/>
-                  </pic:spPr>
-                </pic:pic>
-              </a:graphicData>
-            </a:graphic>
-          </wp:inline>
-        </w:drawing>
-      </w:r>
-    </w:p>
-    <w:p>
-      <w:pPr>
-        <w:spacing w:after="200"/>
-        <w:jc w:val="center"/>
-      </w:pPr>
-      <w:r>
-        <w:rPr>
-          <w:i/>
-          <w:color w:val="595959"/>
-          <w:sz w:val="18"/>
-        </w:rPr>
-        <w:t>Estado del proyecto: terminado, en curso y pendiente</w:t>
-      </w:r>
-    </w:p>
-    <w:p>
-      <w:pPr>
         <w:widowControl/>
       </w:pPr>
       <w:r>
@@ -2010,60 +1794,6 @@
       </w:pPr>
       <w:r>
         <w:t>19. La ruta recomendada desde aquí</w:t>
-      </w:r>
-    </w:p>
-    <w:p>
-      <w:pPr>
-        <w:spacing w:before="120" w:after="60"/>
-        <w:jc w:val="center"/>
-      </w:pPr>
-      <w:r>
-        <w:drawing>
-          <wp:inline xmlns:a="http://schemas.openxmlformats.org/drawingml/2006/main" xmlns:pic="http://schemas.openxmlformats.org/drawingml/2006/picture">
-            <wp:extent cx="6172200" cy="3506932"/>
-            <wp:docPr id="9" name="Picture 9"/>
-            <wp:cNvGraphicFramePr>
-              <a:graphicFrameLocks noChangeAspect="1"/>
-            </wp:cNvGraphicFramePr>
-            <a:graphic>
-              <a:graphicData uri="http://schemas.openxmlformats.org/drawingml/2006/picture">
-                <pic:pic>
-                  <pic:nvPicPr>
-                    <pic:cNvPr id="0" name="09_ruta_tesis_publicacion.png"/>
-                    <pic:cNvPicPr/>
-                  </pic:nvPicPr>
-                  <pic:blipFill>
-                    <a:blip r:embed="rId19"/>
-                    <a:stretch>
-                      <a:fillRect/>
-                    </a:stretch>
-                  </pic:blipFill>
-                  <pic:spPr>
-                    <a:xfrm>
-                      <a:off x="0" y="0"/>
-                      <a:ext cx="6172200" cy="3506932"/>
-                    </a:xfrm>
-                    <a:prstGeom prst="rect"/>
-                  </pic:spPr>
-                </pic:pic>
-              </a:graphicData>
-            </a:graphic>
-          </wp:inline>
-        </w:drawing>
-      </w:r>
-    </w:p>
-    <w:p>
-      <w:pPr>
-        <w:spacing w:after="200"/>
-        <w:jc w:val="center"/>
-      </w:pPr>
-      <w:r>
-        <w:rPr>
-          <w:i/>
-          <w:color w:val="595959"/>
-          <w:sz w:val="18"/>
-        </w:rPr>
-        <w:t>Ruta desde el estándar hasta la tesis y la publicación</w:t>
       </w:r>
     </w:p>
     <w:p>
@@ -2392,318 +2122,6 @@
           <w:sz w:val="19"/>
         </w:rPr>
         <w:t>La dirección automática queda pausada hasta nueva instrucción.</w:t>
-      </w:r>
-    </w:p>
-    <w:p>
-      <w:pPr>
-        <w:pStyle w:val="Heading2"/>
-      </w:pPr>
-      <w:r>
-        <w:t>Anexo B. Documentos esenciales para comprobar esta narración</w:t>
-      </w:r>
-    </w:p>
-    <w:p>
-      <w:pPr>
-        <w:pStyle w:val="ListNumber"/>
-        <w:numPr>
-          <w:ilvl w:val="0"/>
-          <w:numId w:val="18"/>
-        </w:numPr>
-        <w:spacing w:after="0"/>
-      </w:pPr>
-      <w:r>
-        <w:rPr>
-          <w:sz w:val="19"/>
-        </w:rPr>
-        <w:t>00_Gobernanza/Constitucion_GOEI.md</w:t>
-      </w:r>
-    </w:p>
-    <w:p>
-      <w:pPr>
-        <w:pStyle w:val="ListNumber"/>
-        <w:numPr>
-          <w:ilvl w:val="0"/>
-          <w:numId w:val="18"/>
-        </w:numPr>
-        <w:spacing w:after="0"/>
-      </w:pPr>
-      <w:r>
-        <w:rPr>
-          <w:sz w:val="19"/>
-        </w:rPr>
-        <w:t>00_Gobernanza/Registro_de_decisiones.md</w:t>
-      </w:r>
-    </w:p>
-    <w:p>
-      <w:pPr>
-        <w:pStyle w:val="ListNumber"/>
-        <w:numPr>
-          <w:ilvl w:val="0"/>
-          <w:numId w:val="18"/>
-        </w:numPr>
-        <w:spacing w:after="0"/>
-      </w:pPr>
-      <w:r>
-        <w:rPr>
-          <w:sz w:val="19"/>
-        </w:rPr>
-        <w:t>00_Gobernanza/Registro_de_directivas.md</w:t>
-      </w:r>
-    </w:p>
-    <w:p>
-      <w:pPr>
-        <w:pStyle w:val="ListNumber"/>
-        <w:numPr>
-          <w:ilvl w:val="0"/>
-          <w:numId w:val="18"/>
-        </w:numPr>
-        <w:spacing w:after="0"/>
-      </w:pPr>
-      <w:r>
-        <w:rPr>
-          <w:sz w:val="19"/>
-        </w:rPr>
-        <w:t>00_Gobernanza/Preguntas_abiertas.md</w:t>
-      </w:r>
-    </w:p>
-    <w:p>
-      <w:pPr>
-        <w:pStyle w:val="ListNumber"/>
-        <w:numPr>
-          <w:ilvl w:val="0"/>
-          <w:numId w:val="18"/>
-        </w:numPr>
-        <w:spacing w:after="0"/>
-      </w:pPr>
-      <w:r>
-        <w:rPr>
-          <w:sz w:val="19"/>
-        </w:rPr>
-        <w:t>00_Gobernanza/Matriz_de_trazabilidad.md</w:t>
-      </w:r>
-    </w:p>
-    <w:p>
-      <w:pPr>
-        <w:pStyle w:val="ListNumber"/>
-        <w:numPr>
-          <w:ilvl w:val="0"/>
-          <w:numId w:val="18"/>
-        </w:numPr>
-        <w:spacing w:after="0"/>
-      </w:pPr>
-      <w:r>
-        <w:rPr>
-          <w:sz w:val="19"/>
-        </w:rPr>
-        <w:t>00_Gobernanza/coordinacion/ESTADO_MAESTRO.md</w:t>
-      </w:r>
-    </w:p>
-    <w:p>
-      <w:pPr>
-        <w:pStyle w:val="ListNumber"/>
-        <w:numPr>
-          <w:ilvl w:val="0"/>
-          <w:numId w:val="18"/>
-        </w:numPr>
-        <w:spacing w:after="0"/>
-      </w:pPr>
-      <w:r>
-        <w:rPr>
-          <w:sz w:val="19"/>
-        </w:rPr>
-        <w:t>00_Gobernanza/coordinacion/PIPELINE_B2_B10.md</w:t>
-      </w:r>
-    </w:p>
-    <w:p>
-      <w:pPr>
-        <w:pStyle w:val="ListNumber"/>
-        <w:numPr>
-          <w:ilvl w:val="0"/>
-          <w:numId w:val="18"/>
-        </w:numPr>
-        <w:spacing w:after="0"/>
-      </w:pPr>
-      <w:r>
-        <w:rPr>
-          <w:sz w:val="19"/>
-        </w:rPr>
-        <w:t>00_Gobernanza/coordinacion/resoluciones/GOEI_DIR_RES_0001_D008_B1.md</w:t>
-      </w:r>
-    </w:p>
-    <w:p>
-      <w:pPr>
-        <w:pStyle w:val="ListNumber"/>
-        <w:numPr>
-          <w:ilvl w:val="0"/>
-          <w:numId w:val="18"/>
-        </w:numPr>
-        <w:spacing w:after="0"/>
-      </w:pPr>
-      <w:r>
-        <w:rPr>
-          <w:sz w:val="19"/>
-        </w:rPr>
-        <w:t>00_Gobernanza/coordinacion/resoluciones/GOEI_DIR_RES_0002_D017_B2.md</w:t>
-      </w:r>
-    </w:p>
-    <w:p>
-      <w:pPr>
-        <w:pStyle w:val="ListNumber"/>
-        <w:numPr>
-          <w:ilvl w:val="0"/>
-          <w:numId w:val="18"/>
-        </w:numPr>
-        <w:spacing w:after="0"/>
-      </w:pPr>
-      <w:r>
-        <w:rPr>
-          <w:sz w:val="19"/>
-        </w:rPr>
-        <w:t>00_Gobernanza/coordinacion/resoluciones/GOEI_DIR_RES_0003_D018_B3.md</w:t>
-      </w:r>
-    </w:p>
-    <w:p>
-      <w:pPr>
-        <w:pStyle w:val="ListNumber"/>
-        <w:numPr>
-          <w:ilvl w:val="0"/>
-          <w:numId w:val="18"/>
-        </w:numPr>
-        <w:spacing w:after="0"/>
-      </w:pPr>
-      <w:r>
-        <w:rPr>
-          <w:sz w:val="19"/>
-        </w:rPr>
-        <w:t>00_Gobernanza/coordinacion/auditorias/GOEI_AUDIT_0007_B4_Readiness.md</w:t>
-      </w:r>
-    </w:p>
-    <w:p>
-      <w:pPr>
-        <w:pStyle w:val="ListNumber"/>
-        <w:numPr>
-          <w:ilvl w:val="0"/>
-          <w:numId w:val="18"/>
-        </w:numPr>
-        <w:spacing w:after="0"/>
-      </w:pPr>
-      <w:r>
-        <w:rPr>
-          <w:sz w:val="19"/>
-        </w:rPr>
-        <w:t>09_Manual_tecnico_general/Fase4_D006_Ontologia_del_GOEI.md</w:t>
-      </w:r>
-    </w:p>
-    <w:p>
-      <w:pPr>
-        <w:pStyle w:val="ListNumber"/>
-        <w:numPr>
-          <w:ilvl w:val="0"/>
-          <w:numId w:val="18"/>
-        </w:numPr>
-        <w:spacing w:after="0"/>
-      </w:pPr>
-      <w:r>
-        <w:rPr>
-          <w:sz w:val="19"/>
-        </w:rPr>
-        <w:t>04_Procesos_gastronomicos/EPIC-002_GOEI_Universal_Process_MetaModel.md</w:t>
-      </w:r>
-    </w:p>
-    <w:p>
-      <w:pPr>
-        <w:pStyle w:val="ListNumber"/>
-        <w:numPr>
-          <w:ilvl w:val="0"/>
-          <w:numId w:val="18"/>
-        </w:numPr>
-        <w:spacing w:after="0"/>
-      </w:pPr>
-      <w:r>
-        <w:rPr>
-          <w:sz w:val="19"/>
-        </w:rPr>
-        <w:t>03_Taxonomia_negocios/FaseB_B2_Taxonomia_universal_candidata.md</w:t>
-      </w:r>
-    </w:p>
-    <w:p>
-      <w:pPr>
-        <w:pStyle w:val="ListNumber"/>
-        <w:numPr>
-          <w:ilvl w:val="0"/>
-          <w:numId w:val="18"/>
-        </w:numPr>
-        <w:spacing w:after="0"/>
-      </w:pPr>
-      <w:r>
-        <w:rPr>
-          <w:sz w:val="19"/>
-        </w:rPr>
-        <w:t>05_Catalogo_KPI/GOEI_Catalogo_KPI_Candidatos_B3.md</w:t>
-      </w:r>
-    </w:p>
-    <w:p>
-      <w:pPr>
-        <w:pStyle w:val="ListNumber"/>
-        <w:numPr>
-          <w:ilvl w:val="0"/>
-          <w:numId w:val="18"/>
-        </w:numPr>
-        <w:spacing w:after="0"/>
-      </w:pPr>
-      <w:r>
-        <w:rPr>
-          <w:sz w:val="19"/>
-        </w:rPr>
-        <w:t>00_Gobernanza/coordinacion/decisiones_cientificas/GTRM/GOEI_CC_DICTAMEN_GTRM_INTEGRACION.md</w:t>
-      </w:r>
-    </w:p>
-    <w:p>
-      <w:pPr>
-        <w:pStyle w:val="ListNumber"/>
-        <w:numPr>
-          <w:ilvl w:val="0"/>
-          <w:numId w:val="18"/>
-        </w:numPr>
-        <w:spacing w:after="0"/>
-      </w:pPr>
-      <w:r>
-        <w:rPr>
-          <w:sz w:val="19"/>
-        </w:rPr>
-        <w:t>09_Manual_tecnico_general/GOEI_BOK/README.md</w:t>
-      </w:r>
-    </w:p>
-    <w:p>
-      <w:pPr>
-        <w:pStyle w:val="ListNumber"/>
-        <w:numPr>
-          <w:ilvl w:val="0"/>
-          <w:numId w:val="18"/>
-        </w:numPr>
-        <w:spacing w:after="0"/>
-      </w:pPr>
-      <w:r>
-        <w:rPr>
-          <w:sz w:val="19"/>
-        </w:rPr>
-        <w:t>12_Tesis/PLAN_MAESTRO_TESIS_GOEI.md</w:t>
-      </w:r>
-    </w:p>
-    <w:p>
-      <w:pPr>
-        <w:pStyle w:val="ListNumber"/>
-        <w:numPr>
-          <w:ilvl w:val="0"/>
-          <w:numId w:val="18"/>
-        </w:numPr>
-        <w:spacing w:after="0"/>
-      </w:pPr>
-      <w:r>
-        <w:rPr>
-          <w:sz w:val="19"/>
-        </w:rPr>
-        <w:t>12_Tesis/GOEI_Matriz_Requisitos_Tesis.csv</w:t>
       </w:r>
     </w:p>
     <w:sectPr>
@@ -2996,12 +2414,6 @@
     </w:lvlOverride>
   </w:num>
   <w:num w:numId="17">
-    <w:abstractNumId w:val="7"/>
-    <w:lvlOverride w:ilvl="0">
-      <w:startOverride w:val="1"/>
-    </w:lvlOverride>
-  </w:num>
-  <w:num w:numId="18">
     <w:abstractNumId w:val="7"/>
     <w:lvlOverride w:ilvl="0">
       <w:startOverride w:val="1"/>

</xml_diff>